<commit_message>
Actualiza el documento de arquitectura y gráficos del generador
- Modificado el README.md para reflejar el nuevo conteo de páginas, figuras y tablas en el documento de arquitectura de CreditSmart.
- Actualizados los gráficos en charts.py para reflejar cambios en el conteo de archivos y líneas de CSS, así como en la distribución de capas y casos de uso.
- Ajustados los requerimientos funcionales en content_doc.py, incluyendo la numeración de requerimientos y la descripción de servicios de dominio.
- Actualizadas las imágenes de gráficos (chart-capas.png, chart-css.png, chart-hexagono.png) para reflejar los nuevos datos.
</commit_message>
<xml_diff>
--- a/docs/iudigital_doc/CreditSmart_Arquitectura_de_la_Solucion_generado.docx
+++ b/docs/iudigital_doc/CreditSmart_Arquitectura_de_la_Solucion_generado.docx
@@ -1046,7 +1046,7 @@
                 <w:i w:val="0"/>
                 <w:sz w:val="18"/>
               </w:rPr>
-              <w:t>Capturar una solicitud de crédito con datos personales, del crédito y laborales (11 campos en 3 secciones).</w:t>
+              <w:t>Simular un crédito: dado un producto, un monto y un plazo, calcular la cuota mensual, el total de intereses, el total a pagar y la tabla de amortización mes a mes.</w:t>
             </w:r>
           </w:p>
         </w:tc>
@@ -1072,7 +1072,7 @@
                 <w:i w:val="0"/>
                 <w:sz w:val="18"/>
               </w:rPr>
-              <w:t>ApplicationView + ApplicationController</w:t>
+              <w:t>SimulatorView + SimulateCreditUseCase + CreditSimulationService</w:t>
             </w:r>
           </w:p>
         </w:tc>
@@ -1125,7 +1125,7 @@
                 <w:i w:val="0"/>
                 <w:sz w:val="18"/>
               </w:rPr>
-              <w:t>Validar la solicitud: formato de cada campo y coherencia con el producto elegido (monto y plazo admitidos).</w:t>
+              <w:t>Capturar una solicitud de crédito con datos personales, del crédito y laborales (11 campos en 3 secciones).</w:t>
             </w:r>
           </w:p>
         </w:tc>
@@ -1150,7 +1150,7 @@
                 <w:i w:val="0"/>
                 <w:sz w:val="18"/>
               </w:rPr>
-              <w:t>Applicant · RequestedCredit · EmploymentInfo · CreditApplicationPolicy</w:t>
+              <w:t>ApplicationView + ApplicationController</w:t>
             </w:r>
           </w:p>
         </w:tc>
@@ -1205,7 +1205,7 @@
                 <w:i w:val="0"/>
                 <w:sz w:val="18"/>
               </w:rPr>
-              <w:t>Estimar la cuota mensual y evaluar la capacidad de pago (cuota ≤ 40 % del ingreso declarado).</w:t>
+              <w:t>Validar la solicitud: formato de cada campo y coherencia con el producto elegido (monto y plazo admitidos).</w:t>
             </w:r>
           </w:p>
         </w:tc>
@@ -1231,7 +1231,7 @@
                 <w:i w:val="0"/>
                 <w:sz w:val="18"/>
               </w:rPr>
-              <w:t>CreditApplicationPolicy.assessAffordability()</w:t>
+              <w:t>Applicant · RequestedCredit · EmploymentInfo · CreditApplicationPolicy</w:t>
             </w:r>
           </w:p>
         </w:tc>
@@ -1284,7 +1284,7 @@
                 <w:i w:val="0"/>
                 <w:sz w:val="18"/>
               </w:rPr>
-              <w:t>Radicar la solicitud con número de referencia y persistirla.</w:t>
+              <w:t>Estimar la cuota mensual y evaluar la capacidad de pago (cuota ≤ 40 % del ingreso declarado).</w:t>
             </w:r>
           </w:p>
         </w:tc>
@@ -1309,7 +1309,7 @@
                 <w:i w:val="0"/>
                 <w:sz w:val="18"/>
               </w:rPr>
-              <w:t>SubmitCreditApplicationUseCase + LocalStorageCreditApplicationRepository</w:t>
+              <w:t>CreditApplicationPolicy.assessAffordability()</w:t>
             </w:r>
           </w:p>
         </w:tc>
@@ -1364,7 +1364,7 @@
                 <w:i w:val="0"/>
                 <w:sz w:val="18"/>
               </w:rPr>
-              <w:t>Navegar entre las tres pantallas sin recargar la página y con URL limpias compartibles.</w:t>
+              <w:t>Radicar la solicitud con número de referencia y persistirla.</w:t>
             </w:r>
           </w:p>
         </w:tc>
@@ -1390,7 +1390,7 @@
                 <w:i w:val="0"/>
                 <w:sz w:val="18"/>
               </w:rPr>
-              <w:t>HistoryRouter + UrlBuilder + NavbarComponent</w:t>
+              <w:t>SubmitCreditApplicationUseCase + LocalStorageCreditApplicationRepository</w:t>
             </w:r>
           </w:p>
         </w:tc>
@@ -1443,7 +1443,7 @@
                 <w:i w:val="0"/>
                 <w:sz w:val="18"/>
               </w:rPr>
-              <w:t>Mostrar una pantalla 404 para rutas inexistentes.</w:t>
+              <w:t>Navegar entre las tres pantallas sin recargar la página y con URL limpias compartibles.</w:t>
             </w:r>
           </w:p>
         </w:tc>
@@ -1468,7 +1468,7 @@
                 <w:i w:val="0"/>
                 <w:sz w:val="18"/>
               </w:rPr>
-              <w:t>NotFoundView + NotFoundController</w:t>
+              <w:t>HistoryRouter + UrlBuilder + NavbarComponent</w:t>
             </w:r>
           </w:p>
         </w:tc>
@@ -1523,6 +1523,85 @@
                 <w:i w:val="0"/>
                 <w:sz w:val="18"/>
               </w:rPr>
+              <w:t>Mostrar una pantalla 404 para rutas inexistentes.</w:t>
+            </w:r>
+          </w:p>
+        </w:tc>
+        <w:tc>
+          <w:tcPr>
+            <w:tcW w:type="dxa" w:w="4068"/>
+            <w:tcMar>
+              <w:top w:w="40" w:type="dxa"/>
+              <w:left w:w="80" w:type="dxa"/>
+              <w:bottom w:w="40" w:type="dxa"/>
+              <w:right w:w="80" w:type="dxa"/>
+            </w:tcMar>
+            <w:shd w:val="clear" w:color="auto" w:fill="F2F6FB"/>
+          </w:tcPr>
+          <w:p>
+            <w:pPr>
+              <w:spacing w:before="20" w:after="20"/>
+            </w:pPr>
+            <w:r/>
+            <w:r>
+              <w:rPr>
+                <w:b w:val="0"/>
+                <w:i w:val="0"/>
+                <w:sz w:val="18"/>
+              </w:rPr>
+              <w:t>NotFoundView + NotFoundController</w:t>
+            </w:r>
+          </w:p>
+        </w:tc>
+      </w:tr>
+      <w:tr>
+        <w:tc>
+          <w:tcPr>
+            <w:tcW w:type="dxa" w:w="930"/>
+            <w:tcMar>
+              <w:top w:w="40" w:type="dxa"/>
+              <w:left w:w="80" w:type="dxa"/>
+              <w:bottom w:w="40" w:type="dxa"/>
+              <w:right w:w="80" w:type="dxa"/>
+            </w:tcMar>
+          </w:tcPr>
+          <w:p>
+            <w:pPr>
+              <w:spacing w:before="20" w:after="20"/>
+              <w:jc w:val="center"/>
+            </w:pPr>
+            <w:r/>
+            <w:r>
+              <w:rPr>
+                <w:b w:val="0"/>
+                <w:i w:val="0"/>
+                <w:sz w:val="18"/>
+              </w:rPr>
+              <w:t>RF-11</w:t>
+            </w:r>
+          </w:p>
+        </w:tc>
+        <w:tc>
+          <w:tcPr>
+            <w:tcW w:type="dxa" w:w="4300"/>
+            <w:tcMar>
+              <w:top w:w="40" w:type="dxa"/>
+              <w:left w:w="80" w:type="dxa"/>
+              <w:bottom w:w="40" w:type="dxa"/>
+              <w:right w:w="80" w:type="dxa"/>
+            </w:tcMar>
+          </w:tcPr>
+          <w:p>
+            <w:pPr>
+              <w:spacing w:before="20" w:after="20"/>
+            </w:pPr>
+            <w:r/>
+            <w:r>
+              <w:rPr>
+                <w:b w:val="0"/>
+                <w:i w:val="0"/>
+                <w:sz w:val="18"/>
+              </w:rPr>
               <w:t>Notificar al usuario el resultado de sus acciones.</w:t>
             </w:r>
           </w:p>
@@ -1536,7 +1615,6 @@
               <w:bottom w:w="40" w:type="dxa"/>
               <w:right w:w="80" w:type="dxa"/>
             </w:tcMar>
-            <w:shd w:val="clear" w:color="auto" w:fill="F2F6FB"/>
           </w:tcPr>
           <w:p>
             <w:pPr>
@@ -2204,7 +2282,7 @@
                 <w:i w:val="0"/>
                 <w:sz w:val="18"/>
               </w:rPr>
-              <w:t>Sin fuentes web, sin imágenes de producto (emojis), 1.452 líneas de CSS frente a 70 KB de Tailwind del original.</w:t>
+              <w:t>Sin fuentes web, sin imágenes de producto (emojis), 1.681 líneas de CSS frente a 70 KB de Tailwind del original.</w:t>
             </w:r>
           </w:p>
         </w:tc>
@@ -2609,7 +2687,7 @@
                 <w:color w:val="FFFFFF"/>
                 <w:sz w:val="15"/>
               </w:rPr>
-              <w:t>(32 dependencias)</w:t>
+              <w:t>(34 dependencias)</w:t>
             </w:r>
           </w:p>
         </w:tc>
@@ -2942,7 +3020,7 @@
                 <w:i w:val="0"/>
                 <w:sz w:val="18"/>
               </w:rPr>
-              <w:t>73</w:t>
+              <w:t>79</w:t>
             </w:r>
           </w:p>
         </w:tc>
@@ -2993,7 +3071,7 @@
                 <w:i w:val="0"/>
                 <w:sz w:val="18"/>
               </w:rPr>
-              <w:t>5.308</w:t>
+              <w:t>6.881</w:t>
             </w:r>
           </w:p>
         </w:tc>
@@ -3101,7 +3179,7 @@
                 <w:i w:val="0"/>
                 <w:sz w:val="18"/>
               </w:rPr>
-              <w:t>1.452</w:t>
+              <w:t>1.681</w:t>
             </w:r>
           </w:p>
         </w:tc>
@@ -3313,7 +3391,7 @@
                 <w:i w:val="0"/>
                 <w:sz w:val="18"/>
               </w:rPr>
-              <w:t>8</w:t>
+              <w:t>10</w:t>
             </w:r>
           </w:p>
         </w:tc>
@@ -3366,7 +3444,7 @@
                 <w:i w:val="0"/>
                 <w:sz w:val="18"/>
               </w:rPr>
-              <w:t>5 (4 consultas, 1 comando)</w:t>
+              <w:t>6 (5 consultas, 1 comando)</w:t>
             </w:r>
           </w:p>
         </w:tc>
@@ -3417,7 +3495,7 @@
                 <w:i w:val="0"/>
                 <w:sz w:val="18"/>
               </w:rPr>
-              <w:t>1</w:t>
+              <w:t>2</w:t>
             </w:r>
           </w:p>
         </w:tc>
@@ -3684,7 +3762,7 @@
                 <w:i w:val="0"/>
                 <w:sz w:val="18"/>
               </w:rPr>
-              <w:t>32</w:t>
+              <w:t>34</w:t>
             </w:r>
           </w:p>
         </w:tc>
@@ -3764,6 +3842,57 @@
                 <w:i w:val="0"/>
                 <w:sz w:val="18"/>
               </w:rPr>
+              <w:t>Aserciones de prueba</w:t>
+            </w:r>
+          </w:p>
+        </w:tc>
+        <w:tc>
+          <w:tcPr>
+            <w:tcW w:type="dxa" w:w="2034"/>
+            <w:tcMar>
+              <w:top w:w="40" w:type="dxa"/>
+              <w:left w:w="80" w:type="dxa"/>
+              <w:bottom w:w="40" w:type="dxa"/>
+              <w:right w:w="80" w:type="dxa"/>
+            </w:tcMar>
+          </w:tcPr>
+          <w:p>
+            <w:pPr>
+              <w:spacing w:before="20" w:after="20"/>
+              <w:jc w:val="center"/>
+            </w:pPr>
+            <w:r/>
+            <w:r>
+              <w:rPr>
+                <w:b w:val="0"/>
+                <w:i w:val="0"/>
+                <w:sz w:val="18"/>
+              </w:rPr>
+              <w:t>240</w:t>
+            </w:r>
+          </w:p>
+        </w:tc>
+        <w:tc>
+          <w:tcPr>
+            <w:tcW w:type="dxa" w:w="2615"/>
+            <w:tcMar>
+              <w:top w:w="40" w:type="dxa"/>
+              <w:left w:w="80" w:type="dxa"/>
+              <w:bottom w:w="40" w:type="dxa"/>
+              <w:right w:w="80" w:type="dxa"/>
+            </w:tcMar>
+          </w:tcPr>
+          <w:p>
+            <w:pPr>
+              <w:spacing w:before="20" w:after="20"/>
+            </w:pPr>
+            <w:r/>
+            <w:r>
+              <w:rPr>
+                <w:b w:val="0"/>
+                <w:i w:val="0"/>
+                <w:sz w:val="18"/>
+              </w:rPr>
               <w:t>Productos de crédito</w:t>
             </w:r>
           </w:p>
@@ -3794,6 +3923,8 @@
             </w:r>
           </w:p>
         </w:tc>
+      </w:tr>
+      <w:tr>
         <w:tc>
           <w:tcPr>
             <w:tcW w:type="dxa" w:w="2615"/>
@@ -3803,6 +3934,7 @@
               <w:bottom w:w="40" w:type="dxa"/>
               <w:right w:w="80" w:type="dxa"/>
             </w:tcMar>
+            <w:shd w:val="clear" w:color="auto" w:fill="F2F6FB"/>
           </w:tcPr>
           <w:p>
             <w:pPr>
@@ -3828,6 +3960,7 @@
               <w:bottom w:w="40" w:type="dxa"/>
               <w:right w:w="80" w:type="dxa"/>
             </w:tcMar>
+            <w:shd w:val="clear" w:color="auto" w:fill="F2F6FB"/>
           </w:tcPr>
           <w:p>
             <w:pPr>
@@ -3842,6 +3975,59 @@
                 <w:sz w:val="18"/>
               </w:rPr>
               <w:t>3 + comodín 404</w:t>
+            </w:r>
+          </w:p>
+        </w:tc>
+        <w:tc>
+          <w:tcPr>
+            <w:tcW w:type="dxa" w:w="2615"/>
+            <w:tcMar>
+              <w:top w:w="40" w:type="dxa"/>
+              <w:left w:w="80" w:type="dxa"/>
+              <w:bottom w:w="40" w:type="dxa"/>
+              <w:right w:w="80" w:type="dxa"/>
+            </w:tcMar>
+            <w:shd w:val="clear" w:color="auto" w:fill="F2F6FB"/>
+          </w:tcPr>
+          <w:p>
+            <w:pPr>
+              <w:spacing w:before="20" w:after="20"/>
+            </w:pPr>
+            <w:r/>
+            <w:r>
+              <w:rPr>
+                <w:b w:val="0"/>
+                <w:i w:val="0"/>
+                <w:sz w:val="18"/>
+              </w:rPr>
+              <w:t>Dependencias de runtime</w:t>
+            </w:r>
+          </w:p>
+        </w:tc>
+        <w:tc>
+          <w:tcPr>
+            <w:tcW w:type="dxa" w:w="2034"/>
+            <w:tcMar>
+              <w:top w:w="40" w:type="dxa"/>
+              <w:left w:w="80" w:type="dxa"/>
+              <w:bottom w:w="40" w:type="dxa"/>
+              <w:right w:w="80" w:type="dxa"/>
+            </w:tcMar>
+            <w:shd w:val="clear" w:color="auto" w:fill="F2F6FB"/>
+          </w:tcPr>
+          <w:p>
+            <w:pPr>
+              <w:spacing w:before="20" w:after="20"/>
+              <w:jc w:val="center"/>
+            </w:pPr>
+            <w:r/>
+            <w:r>
+              <w:rPr>
+                <w:b w:val="0"/>
+                <w:i w:val="0"/>
+                <w:sz w:val="18"/>
+              </w:rPr>
+              <w:t>0</w:t>
             </w:r>
           </w:p>
         </w:tc>
@@ -3870,7 +4056,7 @@
       <w:r>
         <w:drawing>
           <wp:inline xmlns:a="http://schemas.openxmlformats.org/drawingml/2006/main" xmlns:pic="http://schemas.openxmlformats.org/drawingml/2006/picture">
-            <wp:extent cx="4140000" cy="3681396"/>
+            <wp:extent cx="4140000" cy="3642703"/>
             <wp:docPr id="2" name="Picture 2"/>
             <wp:cNvGraphicFramePr>
               <a:graphicFrameLocks noChangeAspect="1"/>
@@ -3891,7 +4077,7 @@
                   <pic:spPr>
                     <a:xfrm>
                       <a:off x="0" y="0"/>
-                      <a:ext cx="4140000" cy="3681396"/>
+                      <a:ext cx="4140000" cy="3642703"/>
                     </a:xfrm>
                     <a:prstGeom prst="rect"/>
                   </pic:spPr>
@@ -3913,7 +4099,7 @@
           <w:color w:val="6B7280"/>
           <w:sz w:val="17"/>
         </w:rPr>
-        <w:t>Figura 3. Distribución de los 73 archivos JavaScript entre las capas</w:t>
+        <w:t>Figura 3. Distribución de los 79 archivos JavaScript entre las capas</w:t>
       </w:r>
     </w:p>
     <w:p>
@@ -4132,7 +4318,7 @@
                 <w:i w:val="0"/>
                 <w:sz w:val="18"/>
               </w:rPr>
-              <w:t>Entidades, value objects, servicios, criterios, errores y 7 puertos</w:t>
+              <w:t>2 entidades, 10 value objects, 2 servicios, criterios, errores y 7 puertos</w:t>
             </w:r>
           </w:p>
         </w:tc>
@@ -4237,7 +4423,7 @@
                 <w:i w:val="0"/>
                 <w:sz w:val="18"/>
               </w:rPr>
-              <w:t>5 casos de uso, DTOs, mappers, Result y 3 puertos</w:t>
+              <w:t>6 casos de uso, DTOs, mappers, Result y 3 puertos</w:t>
             </w:r>
           </w:p>
         </w:tc>
@@ -5385,7 +5571,7 @@
           <w:i w:val="0"/>
           <w:sz w:val="22"/>
         </w:rPr>
-        <w:t>Al arrancar, main.js llama a container.eagerResolveAll(), que construye las 32 dependencias y ejecuta todas las verificaciones. Consecuencia práctica: un contrato roto impide que cargue la página, en lugar de fallar a mitad de una navegación. Los métodos no implementados lanzan NotImplementedError al invocarse, y assertImplements lanza ContractViolationError con la lista exacta de los métodos que faltan.</w:t>
+        <w:t>Al arrancar, main.js llama a container.eagerResolveAll(), que construye las 34 dependencias y ejecuta todas las verificaciones. Consecuencia práctica: un contrato roto impide que cargue la página, en lugar de fallar a mitad de una navegación. Los métodos no implementados lanzan NotImplementedError al invocarse, y assertImplements lanza ContractViolationError con la lista exacta de los métodos que faltan.</w:t>
       </w:r>
     </w:p>
     <w:p>
@@ -6160,7 +6346,7 @@
                 <w:i w:val="0"/>
                 <w:sz w:val="18"/>
               </w:rPr>
-              <w:t>1.452 líneas en 7 archivos, sin build</w:t>
+              <w:t>1.681 líneas en 7 archivos, sin build</w:t>
             </w:r>
           </w:p>
         </w:tc>
@@ -7386,7 +7572,7 @@
                 <w:color w:val="1F2937"/>
                 <w:sz w:val="17"/>
               </w:rPr>
-              <w:t>├── assets/css/                 7 archivos en cascada (1.452 líneas)</w:t>
+              <w:t>├── assets/css/                 7 archivos en cascada (1.681 líneas)</w:t>
             </w:r>
           </w:p>
           <w:p>
@@ -7581,7 +7767,7 @@
                 <w:color w:val="1F2937"/>
                 <w:sz w:val="17"/>
               </w:rPr>
-              <w:t>│   │   ├── services/           CreditApplicationPolicy</w:t>
+              <w:t>│   │   ├── services/           CreditApplicationPolicy · CreditSimulationService</w:t>
             </w:r>
           </w:p>
           <w:p>
@@ -7646,7 +7832,7 @@
                 <w:color w:val="1F2937"/>
                 <w:sz w:val="17"/>
               </w:rPr>
-              <w:t>│   │   ├── usecases/           5 casos de uso</w:t>
+              <w:t>│   │   ├── usecases/           6 casos de uso</w:t>
             </w:r>
           </w:p>
           <w:p>
@@ -7880,7 +8066,7 @@
                 <w:color w:val="1F2937"/>
                 <w:sz w:val="17"/>
               </w:rPr>
-              <w:t>│       ├── dependencies.js     Composition Root: 32 registros</w:t>
+              <w:t>│       ├── dependencies.js     Composition Root: 34 registros</w:t>
             </w:r>
           </w:p>
           <w:p>
@@ -9358,6 +9544,163 @@
           </w:p>
         </w:tc>
       </w:tr>
+      <w:tr>
+        <w:tc>
+          <w:tcPr>
+            <w:tcW w:type="dxa" w:w="1680"/>
+            <w:tcMar>
+              <w:top w:w="40" w:type="dxa"/>
+              <w:left w:w="80" w:type="dxa"/>
+              <w:bottom w:w="40" w:type="dxa"/>
+              <w:right w:w="80" w:type="dxa"/>
+            </w:tcMar>
+          </w:tcPr>
+          <w:p>
+            <w:pPr>
+              <w:spacing w:before="20" w:after="20"/>
+            </w:pPr>
+            <w:r/>
+            <w:r>
+              <w:rPr>
+                <w:b w:val="0"/>
+                <w:i w:val="0"/>
+                <w:sz w:val="18"/>
+              </w:rPr>
+              <w:t>Installment</w:t>
+            </w:r>
+          </w:p>
+        </w:tc>
+        <w:tc>
+          <w:tcPr>
+            <w:tcW w:type="dxa" w:w="2464"/>
+            <w:tcMar>
+              <w:top w:w="40" w:type="dxa"/>
+              <w:left w:w="80" w:type="dxa"/>
+              <w:bottom w:w="40" w:type="dxa"/>
+              <w:right w:w="80" w:type="dxa"/>
+            </w:tcMar>
+          </w:tcPr>
+          <w:p>
+            <w:pPr>
+              <w:spacing w:before="20" w:after="20"/>
+            </w:pPr>
+            <w:r/>
+            <w:r>
+              <w:rPr>
+                <w:b w:val="0"/>
+                <w:i w:val="0"/>
+                <w:sz w:val="18"/>
+              </w:rPr>
+              <w:t>Una cuota de la tabla de amortización</w:t>
+            </w:r>
+          </w:p>
+        </w:tc>
+        <w:tc>
+          <w:tcPr>
+            <w:tcW w:type="dxa" w:w="5153"/>
+            <w:tcMar>
+              <w:top w:w="40" w:type="dxa"/>
+              <w:left w:w="80" w:type="dxa"/>
+              <w:bottom w:w="40" w:type="dxa"/>
+              <w:right w:w="80" w:type="dxa"/>
+            </w:tcMar>
+          </w:tcPr>
+          <w:p>
+            <w:pPr>
+              <w:spacing w:before="20" w:after="20"/>
+            </w:pPr>
+            <w:r/>
+            <w:r>
+              <w:rPr>
+                <w:b w:val="0"/>
+                <w:i w:val="0"/>
+                <w:sz w:val="18"/>
+              </w:rPr>
+              <w:t>Número entero positivo; los cuatro importes son Money; la cuota es exactamente interés más capital</w:t>
+            </w:r>
+          </w:p>
+        </w:tc>
+      </w:tr>
+      <w:tr>
+        <w:tc>
+          <w:tcPr>
+            <w:tcW w:type="dxa" w:w="1680"/>
+            <w:tcMar>
+              <w:top w:w="40" w:type="dxa"/>
+              <w:left w:w="80" w:type="dxa"/>
+              <w:bottom w:w="40" w:type="dxa"/>
+              <w:right w:w="80" w:type="dxa"/>
+            </w:tcMar>
+            <w:shd w:val="clear" w:color="auto" w:fill="F2F6FB"/>
+          </w:tcPr>
+          <w:p>
+            <w:pPr>
+              <w:spacing w:before="20" w:after="20"/>
+            </w:pPr>
+            <w:r/>
+            <w:r>
+              <w:rPr>
+                <w:b w:val="0"/>
+                <w:i w:val="0"/>
+                <w:sz w:val="18"/>
+              </w:rPr>
+              <w:t>AmortizationPlan</w:t>
+            </w:r>
+          </w:p>
+        </w:tc>
+        <w:tc>
+          <w:tcPr>
+            <w:tcW w:type="dxa" w:w="2464"/>
+            <w:tcMar>
+              <w:top w:w="40" w:type="dxa"/>
+              <w:left w:w="80" w:type="dxa"/>
+              <w:bottom w:w="40" w:type="dxa"/>
+              <w:right w:w="80" w:type="dxa"/>
+            </w:tcMar>
+            <w:shd w:val="clear" w:color="auto" w:fill="F2F6FB"/>
+          </w:tcPr>
+          <w:p>
+            <w:pPr>
+              <w:spacing w:before="20" w:after="20"/>
+            </w:pPr>
+            <w:r/>
+            <w:r>
+              <w:rPr>
+                <w:b w:val="0"/>
+                <w:i w:val="0"/>
+                <w:sz w:val="18"/>
+              </w:rPr>
+              <w:t>El plan de pagos completo de una simulación</w:t>
+            </w:r>
+          </w:p>
+        </w:tc>
+        <w:tc>
+          <w:tcPr>
+            <w:tcW w:type="dxa" w:w="5153"/>
+            <w:tcMar>
+              <w:top w:w="40" w:type="dxa"/>
+              <w:left w:w="80" w:type="dxa"/>
+              <w:bottom w:w="40" w:type="dxa"/>
+              <w:right w:w="80" w:type="dxa"/>
+            </w:tcMar>
+            <w:shd w:val="clear" w:color="auto" w:fill="F2F6FB"/>
+          </w:tcPr>
+          <w:p>
+            <w:pPr>
+              <w:spacing w:before="20" w:after="20"/>
+            </w:pPr>
+            <w:r/>
+            <w:r>
+              <w:rPr>
+                <w:b w:val="0"/>
+                <w:i w:val="0"/>
+                <w:sz w:val="18"/>
+              </w:rPr>
+              <w:t>Una cuota por cada mes del plazo, numeradas sin huecos; la suma de los abonos a capital es igual al capital prestado; la última cuota deja el saldo en cero</w:t>
+            </w:r>
+          </w:p>
+        </w:tc>
+      </w:tr>
     </w:tbl>
     <w:p/>
     <w:p>
@@ -9371,7 +9714,7 @@
           <w:color w:val="6B7280"/>
           <w:sz w:val="17"/>
         </w:rPr>
-        <w:t>Tabla 10. Los ocho value objects y sus invariantes</w:t>
+        <w:t>Tabla 10. Los diez value objects y sus invariantes</w:t>
       </w:r>
     </w:p>
     <w:tbl>
@@ -9571,7 +9914,7 @@
         <w:pStyle w:val="Heading2"/>
       </w:pPr>
       <w:r>
-        <w:t>7.3 Servicio de dominio, criterio y errores</w:t>
+        <w:t>7.3 Servicios de dominio, criterio y errores</w:t>
       </w:r>
     </w:p>
     <w:tbl>
@@ -9782,7 +10125,7 @@
                 <w:i w:val="0"/>
                 <w:sz w:val="18"/>
               </w:rPr>
-              <w:t>ProductSearchCriteria</w:t>
+              <w:t>CreditSimulationService</w:t>
             </w:r>
           </w:p>
         </w:tc>
@@ -9808,7 +10151,7 @@
                 <w:i w:val="0"/>
                 <w:sz w:val="18"/>
               </w:rPr>
-              <w:t>Especificación</w:t>
+              <w:t>Servicio de dominio (sin estado, puro)</w:t>
             </w:r>
           </w:p>
         </w:tc>
@@ -9834,7 +10177,7 @@
                 <w:i w:val="0"/>
                 <w:sz w:val="18"/>
               </w:rPr>
-              <w:t>Encapsula «qué se considera una coincidencia»: texto en nombre o descripción, y solapamiento de rangos de monto</w:t>
+              <w:t>Amortización por el sistema francés: cruza producto, monto y plazo para producir la cuota fija y la tabla mes a mes. Es el único lugar del proyecto donde vive la fórmula de la cuota</w:t>
             </w:r>
           </w:p>
         </w:tc>
@@ -9861,7 +10204,7 @@
                 <w:i w:val="0"/>
                 <w:sz w:val="18"/>
               </w:rPr>
-              <w:t>DomainError</w:t>
+              <w:t>ProductSearchCriteria</w:t>
             </w:r>
           </w:p>
         </w:tc>
@@ -9886,7 +10229,7 @@
                 <w:i w:val="0"/>
                 <w:sz w:val="18"/>
               </w:rPr>
-              <w:t>Error base</w:t>
+              <w:t>Especificación</w:t>
             </w:r>
           </w:p>
         </w:tc>
@@ -9911,7 +10254,7 @@
                 <w:i w:val="0"/>
                 <w:sz w:val="18"/>
               </w:rPr>
-              <w:t>Todo error del dominio lleva un código y detalles, para que la interfaz decida cómo mostrarlo</w:t>
+              <w:t>Encapsula «qué se considera una coincidencia»: texto en nombre o descripción, y solapamiento de rangos de monto</w:t>
             </w:r>
           </w:p>
         </w:tc>
@@ -9939,7 +10282,7 @@
                 <w:i w:val="0"/>
                 <w:sz w:val="18"/>
               </w:rPr>
-              <w:t>ValidationError</w:t>
+              <w:t>DomainError</w:t>
             </w:r>
           </w:p>
         </w:tc>
@@ -9965,7 +10308,7 @@
                 <w:i w:val="0"/>
                 <w:sz w:val="18"/>
               </w:rPr>
-              <w:t>Error de validación</w:t>
+              <w:t>Error base</w:t>
             </w:r>
           </w:p>
         </w:tc>
@@ -9991,7 +10334,7 @@
                 <w:i w:val="0"/>
                 <w:sz w:val="18"/>
               </w:rPr>
-              <w:t>Agrupa los errores por campo del formulario, que la vista pinta bajo cada control</w:t>
+              <w:t>Todo error del dominio lleva un código y detalles, para que la interfaz decida cómo mostrarlo</w:t>
             </w:r>
           </w:p>
         </w:tc>
@@ -10018,7 +10361,7 @@
                 <w:i w:val="0"/>
                 <w:sz w:val="18"/>
               </w:rPr>
-              <w:t>ContractViolationError</w:t>
+              <w:t>ValidationError</w:t>
             </w:r>
           </w:p>
         </w:tc>
@@ -10043,7 +10386,7 @@
                 <w:i w:val="0"/>
                 <w:sz w:val="18"/>
               </w:rPr>
-              <w:t>Error de contrato</w:t>
+              <w:t>Error de validación</w:t>
             </w:r>
           </w:p>
         </w:tc>
@@ -10068,7 +10411,7 @@
                 <w:i w:val="0"/>
                 <w:sz w:val="18"/>
               </w:rPr>
-              <w:t>Se lanza al arrancar si un adaptador no implementa todos los métodos de su puerto</w:t>
+              <w:t>Agrupa los errores por campo del formulario, que la vista pinta bajo cada control</w:t>
             </w:r>
           </w:p>
         </w:tc>
@@ -10096,6 +10439,85 @@
                 <w:i w:val="0"/>
                 <w:sz w:val="18"/>
               </w:rPr>
+              <w:t>ContractViolationError</w:t>
+            </w:r>
+          </w:p>
+        </w:tc>
+        <w:tc>
+          <w:tcPr>
+            <w:tcW w:type="dxa" w:w="2016"/>
+            <w:tcMar>
+              <w:top w:w="40" w:type="dxa"/>
+              <w:left w:w="80" w:type="dxa"/>
+              <w:bottom w:w="40" w:type="dxa"/>
+              <w:right w:w="80" w:type="dxa"/>
+            </w:tcMar>
+            <w:shd w:val="clear" w:color="auto" w:fill="F2F6FB"/>
+          </w:tcPr>
+          <w:p>
+            <w:pPr>
+              <w:spacing w:before="20" w:after="20"/>
+            </w:pPr>
+            <w:r/>
+            <w:r>
+              <w:rPr>
+                <w:b w:val="0"/>
+                <w:i w:val="0"/>
+                <w:sz w:val="18"/>
+              </w:rPr>
+              <w:t>Error de contrato</w:t>
+            </w:r>
+          </w:p>
+        </w:tc>
+        <w:tc>
+          <w:tcPr>
+            <w:tcW w:type="dxa" w:w="5153"/>
+            <w:tcMar>
+              <w:top w:w="40" w:type="dxa"/>
+              <w:left w:w="80" w:type="dxa"/>
+              <w:bottom w:w="40" w:type="dxa"/>
+              <w:right w:w="80" w:type="dxa"/>
+            </w:tcMar>
+            <w:shd w:val="clear" w:color="auto" w:fill="F2F6FB"/>
+          </w:tcPr>
+          <w:p>
+            <w:pPr>
+              <w:spacing w:before="20" w:after="20"/>
+            </w:pPr>
+            <w:r/>
+            <w:r>
+              <w:rPr>
+                <w:b w:val="0"/>
+                <w:i w:val="0"/>
+                <w:sz w:val="18"/>
+              </w:rPr>
+              <w:t>Se lanza al arrancar si un adaptador no implementa todos los métodos de su puerto</w:t>
+            </w:r>
+          </w:p>
+        </w:tc>
+      </w:tr>
+      <w:tr>
+        <w:tc>
+          <w:tcPr>
+            <w:tcW w:type="dxa" w:w="2128"/>
+            <w:tcMar>
+              <w:top w:w="40" w:type="dxa"/>
+              <w:left w:w="80" w:type="dxa"/>
+              <w:bottom w:w="40" w:type="dxa"/>
+              <w:right w:w="80" w:type="dxa"/>
+            </w:tcMar>
+          </w:tcPr>
+          <w:p>
+            <w:pPr>
+              <w:spacing w:before="20" w:after="20"/>
+            </w:pPr>
+            <w:r/>
+            <w:r>
+              <w:rPr>
+                <w:b w:val="0"/>
+                <w:i w:val="0"/>
+                <w:sz w:val="18"/>
+              </w:rPr>
               <w:t>NotImplementedError</w:t>
             </w:r>
           </w:p>
@@ -10109,7 +10531,6 @@
               <w:bottom w:w="40" w:type="dxa"/>
               <w:right w:w="80" w:type="dxa"/>
             </w:tcMar>
-            <w:shd w:val="clear" w:color="auto" w:fill="F2F6FB"/>
           </w:tcPr>
           <w:p>
             <w:pPr>
@@ -10135,7 +10556,6 @@
               <w:bottom w:w="40" w:type="dxa"/>
               <w:right w:w="80" w:type="dxa"/>
             </w:tcMar>
-            <w:shd w:val="clear" w:color="auto" w:fill="F2F6FB"/>
           </w:tcPr>
           <w:p>
             <w:pPr>
@@ -10180,7 +10600,7 @@
           <w:i w:val="0"/>
           <w:sz w:val="22"/>
         </w:rPr>
-        <w:t>La cuota mensual se estima con el sistema de amortización francés, la fórmula estándar de cuota fija:</w:t>
+        <w:t>La cuota mensual se calcula con el sistema de amortización francés, la fórmula estándar de cuota fija. Vive en un solo lugar y tiene dos consumidores: el simulador y el estudio de capacidad de pago de una solicitud. Duplicarla habría permitido que las dos cifras se separaran con cualquier ajuste posterior.</w:t>
       </w:r>
     </w:p>
     <w:tbl>
@@ -10226,7 +10646,7 @@
                 <w:color w:val="1F2937"/>
                 <w:sz w:val="17"/>
               </w:rPr>
-              <w:t>// domain/services/CreditApplicationPolicy.js</w:t>
+              <w:t>// domain/services/CreditSimulationService.js</w:t>
             </w:r>
           </w:p>
           <w:p>
@@ -10252,7 +10672,7 @@
                 <w:color w:val="1F2937"/>
                 <w:sz w:val="17"/>
               </w:rPr>
-              <w:t>//   P = monto solicitado   i = tasa mensual   n = número de cuotas</w:t>
+              <w:t>//   P = capital solicitado   i = tasa mensual   n = número de cuotas</w:t>
             </w:r>
           </w:p>
           <w:p>
@@ -10265,7 +10685,7 @@
                 <w:color w:val="1F2937"/>
                 <w:sz w:val="17"/>
               </w:rPr>
-              <w:t>const cuota = tasaMensual === 0</w:t>
+              <w:t>static monthlyInstallmentAmount(principal, monthlyRate, months) {</w:t>
             </w:r>
           </w:p>
           <w:p>
@@ -10278,7 +10698,7 @@
                 <w:color w:val="1F2937"/>
                 <w:sz w:val="17"/>
               </w:rPr>
-              <w:t xml:space="preserve">  ? monto / n</w:t>
+              <w:t xml:space="preserve">  if (monthlyRate === 0) return principal / months;   // evita dividir por cero</w:t>
             </w:r>
           </w:p>
           <w:p>
@@ -10291,7 +10711,7 @@
                 <w:color w:val="1F2937"/>
                 <w:sz w:val="17"/>
               </w:rPr>
-              <w:t xml:space="preserve">  : (monto * tasaMensual) / (1 - Math.pow(1 + tasaMensual, -n));</w:t>
+              <w:t xml:space="preserve">  return (principal * monthlyRate) / (1 - Math.pow(1 + monthlyRate, -months));</w:t>
             </w:r>
           </w:p>
           <w:p>
@@ -10304,6 +10724,7 @@
                 <w:color w:val="1F2937"/>
                 <w:sz w:val="17"/>
               </w:rPr>
+              <w:t>}</w:t>
             </w:r>
           </w:p>
           <w:p>
@@ -10316,7 +10737,45 @@
                 <w:color w:val="1F2937"/>
                 <w:sz w:val="17"/>
               </w:rPr>
-              <w:t>// Regla de capacidad de pago: la cuota no debe superar el 40 % del ingreso</w:t>
+            </w:r>
+          </w:p>
+          <w:p>
+            <w:pPr>
+              <w:spacing w:after="0" w:before="0"/>
+            </w:pPr>
+            <w:r>
+              <w:rPr>
+                <w:rFonts w:ascii="Consolas" w:hAnsi="Consolas"/>
+                <w:color w:val="1F2937"/>
+                <w:sz w:val="17"/>
+              </w:rPr>
+              <w:t>// domain/services/CreditApplicationPolicy.js — la consume, no la repite</w:t>
+            </w:r>
+          </w:p>
+          <w:p>
+            <w:pPr>
+              <w:spacing w:after="0" w:before="0"/>
+            </w:pPr>
+            <w:r>
+              <w:rPr>
+                <w:rFonts w:ascii="Consolas" w:hAnsi="Consolas"/>
+                <w:color w:val="1F2937"/>
+                <w:sz w:val="17"/>
+              </w:rPr>
+              <w:t>const cuota = CreditSimulationService.monthlyInstallmentAmount(</w:t>
+            </w:r>
+          </w:p>
+          <w:p>
+            <w:pPr>
+              <w:spacing w:after="0" w:before="0"/>
+            </w:pPr>
+            <w:r>
+              <w:rPr>
+                <w:rFonts w:ascii="Consolas" w:hAnsi="Consolas"/>
+                <w:color w:val="1F2937"/>
+                <w:sz w:val="17"/>
+              </w:rPr>
+              <w:t xml:space="preserve">  amount.amount, product.interestRate.monthlyFraction, term.months);</w:t>
             </w:r>
           </w:p>
           <w:p>
@@ -10346,7 +10805,468 @@
           <w:color w:val="6B7280"/>
           <w:sz w:val="17"/>
         </w:rPr>
-        <w:t>Figura 9. Estimación de la cuota y evaluación de la capacidad de pago</w:t>
+        <w:t>Figura 9. La fórmula de la cuota, declarada una vez y consumida dos veces</w:t>
+      </w:r>
+    </w:p>
+    <w:p>
+      <w:pPr>
+        <w:spacing w:after="160"/>
+        <w:jc w:val="both"/>
+      </w:pPr>
+      <w:r>
+        <w:rPr>
+          <w:b w:val="0"/>
+          <w:i w:val="0"/>
+          <w:sz w:val="22"/>
+        </w:rPr>
+        <w:t>La tabla de amortización se construye sobre esa cuota, mes a mes: el interés del período se calcula sobre el saldo vivo y el resto abona capital, de modo que el interés decrece y el abono crece. Como los importes se redondean al peso, la última cuota abona todo el saldo restante en lugar de una cifra fija: absorbe el residuo del redondeo, igual que hace la banca. AmortizationPlan verifica al construirse que la suma de los abonos sea exactamente el capital prestado y que el saldo final sea cero.</w:t>
+      </w:r>
+    </w:p>
+    <w:tbl>
+      <w:tblPr>
+        <w:tblW w:type="auto" w:w="0"/>
+        <w:jc w:val="center"/>
+        <w:tblLayout w:type="fixed"/>
+        <w:tblLook w:firstColumn="1" w:firstRow="1" w:lastColumn="0" w:lastRow="0" w:noHBand="0" w:noVBand="1" w:val="04A0"/>
+        <w:tblBorders>
+          <w:top w:val="single" w:sz="4" w:space="0" w:color="7F7F7F"/>
+          <w:left w:val="single" w:sz="4" w:space="0" w:color="7F7F7F"/>
+          <w:bottom w:val="single" w:sz="4" w:space="0" w:color="7F7F7F"/>
+          <w:right w:val="single" w:sz="4" w:space="0" w:color="7F7F7F"/>
+          <w:insideH w:val="single" w:sz="4" w:space="0" w:color="7F7F7F"/>
+          <w:insideV w:val="single" w:sz="4" w:space="0" w:color="7F7F7F"/>
+        </w:tblBorders>
+        <w:tblLayout w:type="fixed"/>
+        <w:tblW w:w="9298" w:type="dxa"/>
+      </w:tblPr>
+      <w:tblGrid>
+        <w:gridCol w:w="3697"/>
+        <w:gridCol w:w="1456"/>
+        <w:gridCol w:w="1456"/>
+        <w:gridCol w:w="1680"/>
+        <w:gridCol w:w="1008"/>
+      </w:tblGrid>
+      <w:tr>
+        <w:trPr>
+          <w:tblHeader w:val="true"/>
+        </w:trPr>
+        <w:tc>
+          <w:tcPr>
+            <w:tcW w:type="dxa" w:w="3697"/>
+            <w:shd w:val="clear" w:color="auto" w:fill="1F3864"/>
+            <w:tcMar>
+              <w:top w:w="40" w:type="dxa"/>
+              <w:left w:w="80" w:type="dxa"/>
+              <w:bottom w:w="40" w:type="dxa"/>
+              <w:right w:w="80" w:type="dxa"/>
+            </w:tcMar>
+          </w:tcPr>
+          <w:p>
+            <w:pPr>
+              <w:spacing w:before="20" w:after="20"/>
+            </w:pPr>
+            <w:r/>
+            <w:r>
+              <w:rPr>
+                <w:b/>
+                <w:i w:val="0"/>
+                <w:color w:val="FFFFFF"/>
+                <w:sz w:val="18"/>
+              </w:rPr>
+              <w:t>Simulación verificada</w:t>
+            </w:r>
+          </w:p>
+        </w:tc>
+        <w:tc>
+          <w:tcPr>
+            <w:tcW w:type="dxa" w:w="1456"/>
+            <w:shd w:val="clear" w:color="auto" w:fill="1F3864"/>
+            <w:tcMar>
+              <w:top w:w="40" w:type="dxa"/>
+              <w:left w:w="80" w:type="dxa"/>
+              <w:bottom w:w="40" w:type="dxa"/>
+              <w:right w:w="80" w:type="dxa"/>
+            </w:tcMar>
+          </w:tcPr>
+          <w:p>
+            <w:pPr>
+              <w:spacing w:before="20" w:after="20"/>
+            </w:pPr>
+            <w:r/>
+            <w:r>
+              <w:rPr>
+                <w:b/>
+                <w:i w:val="0"/>
+                <w:color w:val="FFFFFF"/>
+                <w:sz w:val="18"/>
+              </w:rPr>
+              <w:t>Cuota fija</w:t>
+            </w:r>
+          </w:p>
+        </w:tc>
+        <w:tc>
+          <w:tcPr>
+            <w:tcW w:type="dxa" w:w="1456"/>
+            <w:shd w:val="clear" w:color="auto" w:fill="1F3864"/>
+            <w:tcMar>
+              <w:top w:w="40" w:type="dxa"/>
+              <w:left w:w="80" w:type="dxa"/>
+              <w:bottom w:w="40" w:type="dxa"/>
+              <w:right w:w="80" w:type="dxa"/>
+            </w:tcMar>
+          </w:tcPr>
+          <w:p>
+            <w:pPr>
+              <w:spacing w:before="20" w:after="20"/>
+            </w:pPr>
+            <w:r/>
+            <w:r>
+              <w:rPr>
+                <w:b/>
+                <w:i w:val="0"/>
+                <w:color w:val="FFFFFF"/>
+                <w:sz w:val="18"/>
+              </w:rPr>
+              <w:t>Última cuota</w:t>
+            </w:r>
+          </w:p>
+        </w:tc>
+        <w:tc>
+          <w:tcPr>
+            <w:tcW w:type="dxa" w:w="1680"/>
+            <w:shd w:val="clear" w:color="auto" w:fill="1F3864"/>
+            <w:tcMar>
+              <w:top w:w="40" w:type="dxa"/>
+              <w:left w:w="80" w:type="dxa"/>
+              <w:bottom w:w="40" w:type="dxa"/>
+              <w:right w:w="80" w:type="dxa"/>
+            </w:tcMar>
+          </w:tcPr>
+          <w:p>
+            <w:pPr>
+              <w:spacing w:before="20" w:after="20"/>
+            </w:pPr>
+            <w:r/>
+            <w:r>
+              <w:rPr>
+                <w:b/>
+                <w:i w:val="0"/>
+                <w:color w:val="FFFFFF"/>
+                <w:sz w:val="18"/>
+              </w:rPr>
+              <w:t>Total intereses</w:t>
+            </w:r>
+          </w:p>
+        </w:tc>
+        <w:tc>
+          <w:tcPr>
+            <w:tcW w:type="dxa" w:w="1008"/>
+            <w:shd w:val="clear" w:color="auto" w:fill="1F3864"/>
+            <w:tcMar>
+              <w:top w:w="40" w:type="dxa"/>
+              <w:left w:w="80" w:type="dxa"/>
+              <w:bottom w:w="40" w:type="dxa"/>
+              <w:right w:w="80" w:type="dxa"/>
+            </w:tcMar>
+          </w:tcPr>
+          <w:p>
+            <w:pPr>
+              <w:spacing w:before="20" w:after="20"/>
+            </w:pPr>
+            <w:r/>
+            <w:r>
+              <w:rPr>
+                <w:b/>
+                <w:i w:val="0"/>
+                <w:color w:val="FFFFFF"/>
+                <w:sz w:val="18"/>
+              </w:rPr>
+              <w:t>Saldo final</w:t>
+            </w:r>
+          </w:p>
+        </w:tc>
+      </w:tr>
+      <w:tr>
+        <w:tc>
+          <w:tcPr>
+            <w:tcW w:type="dxa" w:w="3697"/>
+            <w:tcMar>
+              <w:top w:w="40" w:type="dxa"/>
+              <w:left w:w="80" w:type="dxa"/>
+              <w:bottom w:w="40" w:type="dxa"/>
+              <w:right w:w="80" w:type="dxa"/>
+            </w:tcMar>
+          </w:tcPr>
+          <w:p>
+            <w:pPr>
+              <w:spacing w:before="20" w:after="20"/>
+            </w:pPr>
+            <w:r/>
+            <w:r>
+              <w:rPr>
+                <w:b w:val="0"/>
+                <w:i w:val="0"/>
+                <w:sz w:val="18"/>
+              </w:rPr>
+              <w:t>Libre Inversión · $10.000.000 · 36 meses · 18,5 % E.A.</w:t>
+            </w:r>
+          </w:p>
+        </w:tc>
+        <w:tc>
+          <w:tcPr>
+            <w:tcW w:type="dxa" w:w="1456"/>
+            <w:tcMar>
+              <w:top w:w="40" w:type="dxa"/>
+              <w:left w:w="80" w:type="dxa"/>
+              <w:bottom w:w="40" w:type="dxa"/>
+              <w:right w:w="80" w:type="dxa"/>
+            </w:tcMar>
+          </w:tcPr>
+          <w:p>
+            <w:pPr>
+              <w:spacing w:before="20" w:after="20"/>
+              <w:jc w:val="center"/>
+            </w:pPr>
+            <w:r/>
+            <w:r>
+              <w:rPr>
+                <w:b w:val="0"/>
+                <w:i w:val="0"/>
+                <w:sz w:val="18"/>
+              </w:rPr>
+              <w:t>$357.000</w:t>
+            </w:r>
+          </w:p>
+        </w:tc>
+        <w:tc>
+          <w:tcPr>
+            <w:tcW w:type="dxa" w:w="1456"/>
+            <w:tcMar>
+              <w:top w:w="40" w:type="dxa"/>
+              <w:left w:w="80" w:type="dxa"/>
+              <w:bottom w:w="40" w:type="dxa"/>
+              <w:right w:w="80" w:type="dxa"/>
+            </w:tcMar>
+          </w:tcPr>
+          <w:p>
+            <w:pPr>
+              <w:spacing w:before="20" w:after="20"/>
+              <w:jc w:val="center"/>
+            </w:pPr>
+            <w:r/>
+            <w:r>
+              <w:rPr>
+                <w:b w:val="0"/>
+                <w:i w:val="0"/>
+                <w:sz w:val="18"/>
+              </w:rPr>
+              <w:t>$356.984</w:t>
+            </w:r>
+          </w:p>
+        </w:tc>
+        <w:tc>
+          <w:tcPr>
+            <w:tcW w:type="dxa" w:w="1680"/>
+            <w:tcMar>
+              <w:top w:w="40" w:type="dxa"/>
+              <w:left w:w="80" w:type="dxa"/>
+              <w:bottom w:w="40" w:type="dxa"/>
+              <w:right w:w="80" w:type="dxa"/>
+            </w:tcMar>
+          </w:tcPr>
+          <w:p>
+            <w:pPr>
+              <w:spacing w:before="20" w:after="20"/>
+              <w:jc w:val="center"/>
+            </w:pPr>
+            <w:r/>
+            <w:r>
+              <w:rPr>
+                <w:b w:val="0"/>
+                <w:i w:val="0"/>
+                <w:sz w:val="18"/>
+              </w:rPr>
+              <w:t>$2.851.984</w:t>
+            </w:r>
+          </w:p>
+        </w:tc>
+        <w:tc>
+          <w:tcPr>
+            <w:tcW w:type="dxa" w:w="1008"/>
+            <w:tcMar>
+              <w:top w:w="40" w:type="dxa"/>
+              <w:left w:w="80" w:type="dxa"/>
+              <w:bottom w:w="40" w:type="dxa"/>
+              <w:right w:w="80" w:type="dxa"/>
+            </w:tcMar>
+          </w:tcPr>
+          <w:p>
+            <w:pPr>
+              <w:spacing w:before="20" w:after="20"/>
+              <w:jc w:val="center"/>
+            </w:pPr>
+            <w:r/>
+            <w:r>
+              <w:rPr>
+                <w:b w:val="0"/>
+                <w:i w:val="0"/>
+                <w:sz w:val="18"/>
+              </w:rPr>
+              <w:t>$0</w:t>
+            </w:r>
+          </w:p>
+        </w:tc>
+      </w:tr>
+      <w:tr>
+        <w:tc>
+          <w:tcPr>
+            <w:tcW w:type="dxa" w:w="3697"/>
+            <w:tcMar>
+              <w:top w:w="40" w:type="dxa"/>
+              <w:left w:w="80" w:type="dxa"/>
+              <w:bottom w:w="40" w:type="dxa"/>
+              <w:right w:w="80" w:type="dxa"/>
+            </w:tcMar>
+            <w:shd w:val="clear" w:color="auto" w:fill="F2F6FB"/>
+          </w:tcPr>
+          <w:p>
+            <w:pPr>
+              <w:spacing w:before="20" w:after="20"/>
+            </w:pPr>
+            <w:r/>
+            <w:r>
+              <w:rPr>
+                <w:b w:val="0"/>
+                <w:i w:val="0"/>
+                <w:sz w:val="18"/>
+              </w:rPr>
+              <w:t>Vivienda · $300.000.000 · 240 meses · 11,8 % E.A.</w:t>
+            </w:r>
+          </w:p>
+        </w:tc>
+        <w:tc>
+          <w:tcPr>
+            <w:tcW w:type="dxa" w:w="1456"/>
+            <w:tcMar>
+              <w:top w:w="40" w:type="dxa"/>
+              <w:left w:w="80" w:type="dxa"/>
+              <w:bottom w:w="40" w:type="dxa"/>
+              <w:right w:w="80" w:type="dxa"/>
+            </w:tcMar>
+            <w:shd w:val="clear" w:color="auto" w:fill="F2F6FB"/>
+          </w:tcPr>
+          <w:p>
+            <w:pPr>
+              <w:spacing w:before="20" w:after="20"/>
+              <w:jc w:val="center"/>
+            </w:pPr>
+            <w:r/>
+            <w:r>
+              <w:rPr>
+                <w:b w:val="0"/>
+                <w:i w:val="0"/>
+                <w:sz w:val="18"/>
+              </w:rPr>
+              <w:t>$3.138.761</w:t>
+            </w:r>
+          </w:p>
+        </w:tc>
+        <w:tc>
+          <w:tcPr>
+            <w:tcW w:type="dxa" w:w="1456"/>
+            <w:tcMar>
+              <w:top w:w="40" w:type="dxa"/>
+              <w:left w:w="80" w:type="dxa"/>
+              <w:bottom w:w="40" w:type="dxa"/>
+              <w:right w:w="80" w:type="dxa"/>
+            </w:tcMar>
+            <w:shd w:val="clear" w:color="auto" w:fill="F2F6FB"/>
+          </w:tcPr>
+          <w:p>
+            <w:pPr>
+              <w:spacing w:before="20" w:after="20"/>
+              <w:jc w:val="center"/>
+            </w:pPr>
+            <w:r/>
+            <w:r>
+              <w:rPr>
+                <w:b w:val="0"/>
+                <w:i w:val="0"/>
+                <w:sz w:val="18"/>
+              </w:rPr>
+              <w:t>$3.139.123</w:t>
+            </w:r>
+          </w:p>
+        </w:tc>
+        <w:tc>
+          <w:tcPr>
+            <w:tcW w:type="dxa" w:w="1680"/>
+            <w:tcMar>
+              <w:top w:w="40" w:type="dxa"/>
+              <w:left w:w="80" w:type="dxa"/>
+              <w:bottom w:w="40" w:type="dxa"/>
+              <w:right w:w="80" w:type="dxa"/>
+            </w:tcMar>
+            <w:shd w:val="clear" w:color="auto" w:fill="F2F6FB"/>
+          </w:tcPr>
+          <w:p>
+            <w:pPr>
+              <w:spacing w:before="20" w:after="20"/>
+              <w:jc w:val="center"/>
+            </w:pPr>
+            <w:r/>
+            <w:r>
+              <w:rPr>
+                <w:b w:val="0"/>
+                <w:i w:val="0"/>
+                <w:sz w:val="18"/>
+              </w:rPr>
+              <w:t>$453.303.002</w:t>
+            </w:r>
+          </w:p>
+        </w:tc>
+        <w:tc>
+          <w:tcPr>
+            <w:tcW w:type="dxa" w:w="1008"/>
+            <w:tcMar>
+              <w:top w:w="40" w:type="dxa"/>
+              <w:left w:w="80" w:type="dxa"/>
+              <w:bottom w:w="40" w:type="dxa"/>
+              <w:right w:w="80" w:type="dxa"/>
+            </w:tcMar>
+            <w:shd w:val="clear" w:color="auto" w:fill="F2F6FB"/>
+          </w:tcPr>
+          <w:p>
+            <w:pPr>
+              <w:spacing w:before="20" w:after="20"/>
+              <w:jc w:val="center"/>
+            </w:pPr>
+            <w:r/>
+            <w:r>
+              <w:rPr>
+                <w:b w:val="0"/>
+                <w:i w:val="0"/>
+                <w:sz w:val="18"/>
+              </w:rPr>
+              <w:t>$0</w:t>
+            </w:r>
+          </w:p>
+        </w:tc>
+      </w:tr>
+    </w:tbl>
+    <w:p/>
+    <w:p>
+      <w:pPr>
+        <w:spacing w:after="200"/>
+        <w:jc w:val="center"/>
+      </w:pPr>
+      <w:r>
+        <w:rPr>
+          <w:i/>
+          <w:color w:val="6B7280"/>
+          <w:sz w:val="17"/>
+        </w:rPr>
+        <w:t>Tabla 12. Resultados comprobados en la suite de pruebas. El caso de 240 meses es el que demuestra que el reparto del redondeo cierra: a veinte años de cuotas, el capital sigue cuadrando al peso</w:t>
       </w:r>
     </w:p>
     <w:p>
@@ -11130,7 +12050,7 @@
           <w:color w:val="6B7280"/>
           <w:sz w:val="17"/>
         </w:rPr>
-        <w:t>Tabla 12. Puertos declarados por el dominio y adaptadores que los satisfacen hoy</w:t>
+        <w:t>Tabla 13. Puertos declarados por el dominio y adaptadores que los satisfacen hoy</w:t>
       </w:r>
     </w:p>
     <w:p>
@@ -11734,6 +12654,109 @@
                 <w:i w:val="0"/>
                 <w:sz w:val="18"/>
               </w:rPr>
+              <w:t>SimulateCreditUseCase</w:t>
+            </w:r>
+          </w:p>
+        </w:tc>
+        <w:tc>
+          <w:tcPr>
+            <w:tcW w:type="dxa" w:w="1094"/>
+            <w:tcMar>
+              <w:top w:w="40" w:type="dxa"/>
+              <w:left w:w="80" w:type="dxa"/>
+              <w:bottom w:w="40" w:type="dxa"/>
+              <w:right w:w="80" w:type="dxa"/>
+            </w:tcMar>
+          </w:tcPr>
+          <w:p>
+            <w:pPr>
+              <w:spacing w:before="20" w:after="20"/>
+            </w:pPr>
+            <w:r/>
+            <w:r>
+              <w:rPr>
+                <w:b w:val="0"/>
+                <w:i w:val="0"/>
+                <w:sz w:val="18"/>
+              </w:rPr>
+              <w:t>Consulta</w:t>
+            </w:r>
+          </w:p>
+        </w:tc>
+        <w:tc>
+          <w:tcPr>
+            <w:tcW w:type="dxa" w:w="2406"/>
+            <w:tcMar>
+              <w:top w:w="40" w:type="dxa"/>
+              <w:left w:w="80" w:type="dxa"/>
+              <w:bottom w:w="40" w:type="dxa"/>
+              <w:right w:w="80" w:type="dxa"/>
+            </w:tcMar>
+          </w:tcPr>
+          <w:p>
+            <w:pPr>
+              <w:spacing w:before="20" w:after="20"/>
+            </w:pPr>
+            <w:r/>
+            <w:r>
+              <w:rPr>
+                <w:b w:val="0"/>
+                <w:i w:val="0"/>
+                <w:sz w:val="18"/>
+              </w:rPr>
+              <w:t>productRepository, simulationMapper</w:t>
+            </w:r>
+          </w:p>
+        </w:tc>
+        <w:tc>
+          <w:tcPr>
+            <w:tcW w:type="dxa" w:w="3282"/>
+            <w:tcMar>
+              <w:top w:w="40" w:type="dxa"/>
+              <w:left w:w="80" w:type="dxa"/>
+              <w:bottom w:w="40" w:type="dxa"/>
+              <w:right w:w="80" w:type="dxa"/>
+            </w:tcMar>
+          </w:tcPr>
+          <w:p>
+            <w:pPr>
+              <w:spacing w:before="20" w:after="20"/>
+            </w:pPr>
+            <w:r/>
+            <w:r>
+              <w:rPr>
+                <w:b w:val="0"/>
+                <w:i w:val="0"/>
+                <w:sz w:val="18"/>
+              </w:rPr>
+              <w:t>Result&lt;SimulationDTO&gt; — cuota, totales y tabla de amortización</w:t>
+            </w:r>
+          </w:p>
+        </w:tc>
+      </w:tr>
+      <w:tr>
+        <w:tc>
+          <w:tcPr>
+            <w:tcW w:type="dxa" w:w="2516"/>
+            <w:tcMar>
+              <w:top w:w="40" w:type="dxa"/>
+              <w:left w:w="80" w:type="dxa"/>
+              <w:bottom w:w="40" w:type="dxa"/>
+              <w:right w:w="80" w:type="dxa"/>
+            </w:tcMar>
+            <w:shd w:val="clear" w:color="auto" w:fill="F2F6FB"/>
+          </w:tcPr>
+          <w:p>
+            <w:pPr>
+              <w:spacing w:before="20" w:after="20"/>
+            </w:pPr>
+            <w:r/>
+            <w:r>
+              <w:rPr>
+                <w:b w:val="0"/>
+                <w:i w:val="0"/>
+                <w:sz w:val="18"/>
+              </w:rPr>
               <w:t>SubmitCreditApplicationUseCase</w:t>
             </w:r>
           </w:p>
@@ -11747,6 +12770,7 @@
               <w:bottom w:w="40" w:type="dxa"/>
               <w:right w:w="80" w:type="dxa"/>
             </w:tcMar>
+            <w:shd w:val="clear" w:color="auto" w:fill="F2F6FB"/>
           </w:tcPr>
           <w:p>
             <w:pPr>
@@ -11772,6 +12796,7 @@
               <w:bottom w:w="40" w:type="dxa"/>
               <w:right w:w="80" w:type="dxa"/>
             </w:tcMar>
+            <w:shd w:val="clear" w:color="auto" w:fill="F2F6FB"/>
           </w:tcPr>
           <w:p>
             <w:pPr>
@@ -11797,6 +12822,7 @@
               <w:bottom w:w="40" w:type="dxa"/>
               <w:right w:w="80" w:type="dxa"/>
             </w:tcMar>
+            <w:shd w:val="clear" w:color="auto" w:fill="F2F6FB"/>
           </w:tcPr>
           <w:p>
             <w:pPr>
@@ -11827,7 +12853,7 @@
           <w:color w:val="6B7280"/>
           <w:sz w:val="17"/>
         </w:rPr>
-        <w:t>Tabla 13. Los cinco casos de uso: cuatro consultas y un comando</w:t>
+        <w:t>Tabla 14. Los seis casos de uso: cinco consultas y un comando</w:t>
       </w:r>
     </w:p>
     <w:tbl>
@@ -13401,7 +14427,7 @@
           <w:color w:val="6B7280"/>
           <w:sz w:val="17"/>
         </w:rPr>
-        <w:t>Tabla 14. Los once adaptadores de infraestructura</w:t>
+        <w:t>Tabla 15. Los once adaptadores de infraestructura</w:t>
       </w:r>
     </w:p>
     <w:tbl>
@@ -14043,7 +15069,7 @@
           <w:color w:val="6B7280"/>
           <w:sz w:val="17"/>
         </w:rPr>
-        <w:t>Tabla 15. Reparto de responsabilidades en la capa de presentación</w:t>
+        <w:t>Tabla 16. Reparto de responsabilidades en la capa de presentación</w:t>
       </w:r>
     </w:p>
     <w:p>
@@ -14827,7 +15853,7 @@
           <w:color w:val="6B7280"/>
           <w:sz w:val="17"/>
         </w:rPr>
-        <w:t>Tabla 16. Correspondencia pantalla · vista · controlador · casos de uso</w:t>
+        <w:t>Tabla 17. Correspondencia pantalla · vista · controlador · casos de uso</w:t>
       </w:r>
     </w:p>
     <w:p>
@@ -15319,7 +16345,7 @@
                 <w:i w:val="0"/>
                 <w:sz w:val="18"/>
               </w:rPr>
-              <w:t>Búsqueda y filtros</w:t>
+              <w:t>Simulador de crédito y catálogo filtrable</w:t>
             </w:r>
           </w:p>
         </w:tc>
@@ -15650,7 +16676,7 @@
           <w:color w:val="6B7280"/>
           <w:sz w:val="17"/>
         </w:rPr>
-        <w:t>Tabla 17. Tabla de rutas declarada en config/routes.js. El archivo no tiene imports: solo constantes y nombres de controlador, lo que evita dependencias circulares</w:t>
+        <w:t>Tabla 18. Tabla de rutas declarada en config/routes.js. El archivo no tiene imports: solo constantes y nombres de controlador, lo que evita dependencias circulares</w:t>
       </w:r>
     </w:p>
     <w:p>
@@ -17080,7 +18106,7 @@
           <w:color w:val="6B7280"/>
           <w:sz w:val="17"/>
         </w:rPr>
-        <w:t>Tabla 18. Superficie interna del sistema y su correspondencia con una API REST futura</w:t>
+        <w:t>Tabla 19. Superficie interna del sistema y su correspondencia con una API REST futura</w:t>
       </w:r>
     </w:p>
     <w:p>
@@ -17760,7 +18786,7 @@
           <w:color w:val="6B7280"/>
           <w:sz w:val="17"/>
         </w:rPr>
-        <w:t>Tabla 19. Parámetros de configuración y persistencia</w:t>
+        <w:t>Tabla 20. Parámetros de configuración y persistencia</w:t>
       </w:r>
     </w:p>
     <w:p>
@@ -18147,7 +19173,7 @@
                 <w:i w:val="0"/>
                 <w:sz w:val="17"/>
               </w:rPr>
-              <w:t>Registra 32 factorías perezosas: todavía no se construye nada</w:t>
+              <w:t>Registra 34 factorías perezosas: todavía no se construye nada</w:t>
             </w:r>
           </w:p>
         </w:tc>
@@ -18229,7 +19255,7 @@
                 <w:i w:val="0"/>
                 <w:sz w:val="17"/>
               </w:rPr>
-              <w:t>Construye las 32 dependencias y verifica cada adaptador contra su puerto con assertImplements. Un contrato roto falla AQUÍ, no a mitad de una navegación</w:t>
+              <w:t>Construye las 34 dependencias y verifica cada adaptador contra su puerto con assertImplements. Un contrato roto falla AQUÍ, no a mitad de una navegación</w:t>
             </w:r>
           </w:p>
         </w:tc>
@@ -19599,7 +20625,7 @@
         <w:pStyle w:val="Heading2"/>
       </w:pPr>
       <w:r>
-        <w:t>12.4 Radicar una solicitud de crédito</w:t>
+        <w:t>12.4 Simular un crédito</w:t>
       </w:r>
     </w:p>
     <w:tbl>
@@ -19762,7 +20788,7 @@
                 <w:color w:val="1F2937"/>
                 <w:sz w:val="17"/>
               </w:rPr>
-              <w:t>El usuario envía el formulario</w:t>
+              <w:t>El usuario teclea el monto</w:t>
             </w:r>
           </w:p>
         </w:tc>
@@ -19787,7 +20813,7 @@
                 <w:i w:val="0"/>
                 <w:sz w:val="17"/>
               </w:rPr>
-              <w:t>La vista entrega los 11 campos crudos al controlador, sin interpretarlos</w:t>
+              <w:t>La vista lee el formulario y llama handlers.onSimulate({ amount, termInMonths }): transmite la intención y el campo que tiene el foco, nada más</w:t>
             </w:r>
           </w:p>
         </w:tc>
@@ -19796,7 +20822,7 @@
         <w:tc>
           <w:tcPr>
             <w:tcW w:type="dxa" w:w="1757"/>
-            <w:shd w:val="clear" w:color="auto" w:fill="8B5CF6"/>
+            <w:shd w:val="clear" w:color="auto" w:fill="1D4ED8"/>
             <w:tcMar>
               <w:top w:w="40" w:type="dxa"/>
               <w:left w:w="80" w:type="dxa"/>
@@ -19818,7 +20844,7 @@
                 <w:color w:val="FFFFFF"/>
                 <w:sz w:val="13"/>
               </w:rPr>
-              <w:t>APLICACIÓN</w:t>
+              <w:t>PRESENTACIÓN</w:t>
             </w:r>
           </w:p>
         </w:tc>
@@ -19844,7 +20870,7 @@
                 <w:color w:val="1F2937"/>
                 <w:sz w:val="17"/>
               </w:rPr>
-              <w:t>SubmitCreditApplicationUseCase.execute()</w:t>
+              <w:t>SimulatorController.onSimulate()</w:t>
             </w:r>
           </w:p>
         </w:tc>
@@ -19869,7 +20895,7 @@
                 <w:i w:val="0"/>
                 <w:sz w:val="17"/>
               </w:rPr>
-              <w:t>Orquesta la secuencia completa y captura cualquier error para devolverlo como Result</w:t>
+              <w:t>Actualiza su estado de interfaz y pide una simulación nueva. No calcula nada: no hay una sola operación aritmética sobre dinero en el controlador</w:t>
             </w:r>
           </w:p>
         </w:tc>
@@ -19878,7 +20904,7 @@
         <w:tc>
           <w:tcPr>
             <w:tcW w:type="dxa" w:w="1757"/>
-            <w:shd w:val="clear" w:color="auto" w:fill="1F3864"/>
+            <w:shd w:val="clear" w:color="auto" w:fill="8B5CF6"/>
             <w:tcMar>
               <w:top w:w="40" w:type="dxa"/>
               <w:left w:w="80" w:type="dxa"/>
@@ -19900,7 +20926,7 @@
                 <w:color w:val="FFFFFF"/>
                 <w:sz w:val="13"/>
               </w:rPr>
-              <w:t>DOMINIO</w:t>
+              <w:t>APLICACIÓN</w:t>
             </w:r>
           </w:p>
         </w:tc>
@@ -19926,7 +20952,7 @@
                 <w:color w:val="1F2937"/>
                 <w:sz w:val="17"/>
               </w:rPr>
-              <w:t>Construcción de los value objects</w:t>
+              <w:t>SimulateCreditUseCase.execute()</w:t>
             </w:r>
           </w:p>
         </w:tc>
@@ -19951,7 +20977,7 @@
                 <w:i w:val="0"/>
                 <w:sz w:val="17"/>
               </w:rPr>
-              <w:t>Applicant, RequestedCredit y EmploymentInfo validan nombre, cédula, correo, teléfono, monto, plazo, destino, empresa, cargo e ingresos</w:t>
+              <w:t>Busca el producto por id, convierte el texto del formulario en Money y Term acumulando los errores de forma, y delega el cálculo</w:t>
             </w:r>
           </w:p>
         </w:tc>
@@ -20008,7 +21034,7 @@
                 <w:color w:val="1F2937"/>
                 <w:sz w:val="17"/>
               </w:rPr>
-              <w:t>CreditApplicationPolicy.assertAdmissible()</w:t>
+              <w:t>CreditSimulationService.simulate()</w:t>
             </w:r>
           </w:p>
         </w:tc>
@@ -20033,7 +21059,7 @@
                 <w:i w:val="0"/>
                 <w:sz w:val="17"/>
               </w:rPr>
-              <w:t>Comprueba que el monto y el plazo estén dentro de lo que admite el producto elegido; si no, lanza ValidationError con el mensaje por campo</w:t>
+              <w:t>Comprueba que el producto admita ese monto y ese plazo, obtiene la tasa mensual equivalente y construye la tabla mes a mes con la cuota del sistema francés</w:t>
             </w:r>
           </w:p>
         </w:tc>
@@ -20090,7 +21116,7 @@
                 <w:color w:val="1F2937"/>
                 <w:sz w:val="17"/>
               </w:rPr>
-              <w:t>assessAffordability()</w:t>
+              <w:t>AmortizationPlan</w:t>
             </w:r>
           </w:p>
         </w:tc>
@@ -20115,7 +21141,7 @@
                 <w:i w:val="0"/>
                 <w:sz w:val="17"/>
               </w:rPr>
-              <w:t>Estima la cuota con el sistema francés y verifica que no supere el 40 % del ingreso declarado</w:t>
+              <w:t>Verifica las cuatro invariantes del plan: una cuota por mes, numeración correlativa, capital cuadrado al peso y saldo final en cero</w:t>
             </w:r>
           </w:p>
         </w:tc>
@@ -20124,7 +21150,7 @@
         <w:tc>
           <w:tcPr>
             <w:tcW w:type="dxa" w:w="1757"/>
-            <w:shd w:val="clear" w:color="auto" w:fill="1F3864"/>
+            <w:shd w:val="clear" w:color="auto" w:fill="8B5CF6"/>
             <w:tcMar>
               <w:top w:w="40" w:type="dxa"/>
               <w:left w:w="80" w:type="dxa"/>
@@ -20146,7 +21172,7 @@
                 <w:color w:val="FFFFFF"/>
                 <w:sz w:val="13"/>
               </w:rPr>
-              <w:t>DOMINIO</w:t>
+              <w:t>APLICACIÓN</w:t>
             </w:r>
           </w:p>
         </w:tc>
@@ -20172,7 +21198,7 @@
                 <w:color w:val="1F2937"/>
                 <w:sz w:val="17"/>
               </w:rPr>
-              <w:t>application.submit()</w:t>
+              <w:t>SimulationMapper.toDTO()</w:t>
             </w:r>
           </w:p>
         </w:tc>
@@ -20197,7 +21223,7 @@
                 <w:i w:val="0"/>
                 <w:sz w:val="17"/>
               </w:rPr>
-              <w:t>Transición DRAFT → SUBMITTED y generación de la referencia CS-XXXXXXXX</w:t>
+              <w:t>Aplana el plan en un objeto plano y congelado, con los importes ya formateados en pesos colombianos por IMoneyFormatter</w:t>
             </w:r>
           </w:p>
         </w:tc>
@@ -20206,7 +21232,7 @@
         <w:tc>
           <w:tcPr>
             <w:tcW w:type="dxa" w:w="1757"/>
-            <w:shd w:val="clear" w:color="auto" w:fill="F59E0B"/>
+            <w:shd w:val="clear" w:color="auto" w:fill="1D4ED8"/>
             <w:tcMar>
               <w:top w:w="40" w:type="dxa"/>
               <w:left w:w="80" w:type="dxa"/>
@@ -20228,7 +21254,7 @@
                 <w:color w:val="FFFFFF"/>
                 <w:sz w:val="13"/>
               </w:rPr>
-              <w:t>INFRAESTRUCTURA</w:t>
+              <w:t>PRESENTACIÓN</w:t>
             </w:r>
           </w:p>
         </w:tc>
@@ -20254,7 +21280,7 @@
                 <w:color w:val="1F2937"/>
                 <w:sz w:val="17"/>
               </w:rPr>
-              <w:t>LocalStorageCreditApplicationRepository.save()</w:t>
+              <w:t>update() en lugar de present()</w:t>
             </w:r>
           </w:p>
         </w:tc>
@@ -20279,89 +21305,7 @@
                 <w:i w:val="0"/>
                 <w:sz w:val="17"/>
               </w:rPr>
-              <w:t>Persiste la solicitud; si localStorage no está disponible, guarda en memoria</w:t>
-            </w:r>
-          </w:p>
-        </w:tc>
-      </w:tr>
-      <w:tr>
-        <w:tc>
-          <w:tcPr>
-            <w:tcW w:type="dxa" w:w="1757"/>
-            <w:shd w:val="clear" w:color="auto" w:fill="1D4ED8"/>
-            <w:tcMar>
-              <w:top w:w="40" w:type="dxa"/>
-              <w:left w:w="80" w:type="dxa"/>
-              <w:bottom w:w="40" w:type="dxa"/>
-              <w:right w:w="80" w:type="dxa"/>
-            </w:tcMar>
-            <w:vAlign w:val="center"/>
-          </w:tcPr>
-          <w:p>
-            <w:pPr>
-              <w:spacing w:before="20" w:after="20"/>
-              <w:jc w:val="center"/>
-            </w:pPr>
-            <w:r/>
-            <w:r>
-              <w:rPr>
-                <w:b/>
-                <w:i w:val="0"/>
-                <w:color w:val="FFFFFF"/>
-                <w:sz w:val="13"/>
-              </w:rPr>
-              <w:t>PRESENTACIÓN</w:t>
-            </w:r>
-          </w:p>
-        </w:tc>
-        <w:tc>
-          <w:tcPr>
-            <w:tcW w:type="dxa" w:w="2721"/>
-            <w:tcMar>
-              <w:top w:w="40" w:type="dxa"/>
-              <w:left w:w="80" w:type="dxa"/>
-              <w:bottom w:w="40" w:type="dxa"/>
-              <w:right w:w="80" w:type="dxa"/>
-            </w:tcMar>
-          </w:tcPr>
-          <w:p>
-            <w:pPr>
-              <w:spacing w:before="20" w:after="20"/>
-            </w:pPr>
-            <w:r/>
-            <w:r>
-              <w:rPr>
-                <w:b/>
-                <w:i w:val="0"/>
-                <w:color w:val="1F2937"/>
-                <w:sz w:val="17"/>
-              </w:rPr>
-              <w:t>Confirmación en pantalla</w:t>
-            </w:r>
-          </w:p>
-        </w:tc>
-        <w:tc>
-          <w:tcPr>
-            <w:tcW w:type="dxa" w:w="4819"/>
-            <w:tcMar>
-              <w:top w:w="40" w:type="dxa"/>
-              <w:left w:w="80" w:type="dxa"/>
-              <w:bottom w:w="40" w:type="dxa"/>
-              <w:right w:w="80" w:type="dxa"/>
-            </w:tcMar>
-          </w:tcPr>
-          <w:p>
-            <w:pPr>
-              <w:spacing w:before="20" w:after="20"/>
-            </w:pPr>
-            <w:r/>
-            <w:r>
-              <w:rPr>
-                <w:b w:val="0"/>
-                <w:i w:val="0"/>
-                <w:sz w:val="17"/>
-              </w:rPr>
-              <w:t>Se muestra el número de radicación y un aviso accesible; si hubo errores, cada mensaje aparece bajo su campo</w:t>
+              <w:t>Se repintan la cuota, los totales y la tabla; el foco vuelve al campo que se estaba tecleando y la página no salta al inicio</w:t>
             </w:r>
           </w:p>
         </w:tc>
@@ -20379,7 +21323,814 @@
           <w:color w:val="6B7280"/>
           <w:sz w:val="17"/>
         </w:rPr>
-        <w:t>Figura 14. Flujo 4: validación, política de dominio, radicación y persistencia</w:t>
+        <w:t>Figura 14. Flujo 4: el cálculo financiero ocurre en el dominio, tres capas por debajo del input; la vista solo interpola texto ya formateado</w:t>
+      </w:r>
+    </w:p>
+    <w:p>
+      <w:pPr>
+        <w:spacing w:after="160"/>
+        <w:jc w:val="both"/>
+      </w:pPr>
+      <w:r>
+        <w:rPr>
+          <w:b w:val="0"/>
+          <w:i w:val="0"/>
+          <w:sz w:val="22"/>
+        </w:rPr>
+        <w:t>Si el monto se sale del rango del producto, el dominio lanza un error por campo que el caso de uso devuelve como valor dentro del Result. La vista lo pinta bajo el control correspondiente y —decisión deliberada— conserva en pantalla la última cuota válida mientras el usuario corrige: borrarla haría parpadear el panel en cada tecla intermedia de un número largo.</w:t>
+      </w:r>
+    </w:p>
+    <w:p>
+      <w:r>
+        <w:br w:type="page"/>
+      </w:r>
+    </w:p>
+    <w:p>
+      <w:pPr>
+        <w:pStyle w:val="Heading2"/>
+      </w:pPr>
+      <w:r>
+        <w:t>12.5 Radicar una solicitud de crédito</w:t>
+      </w:r>
+    </w:p>
+    <w:tbl>
+      <w:tblPr>
+        <w:tblW w:type="auto" w:w="0"/>
+        <w:jc w:val="center"/>
+        <w:tblLayout w:type="fixed"/>
+        <w:tblLook w:firstColumn="1" w:firstRow="1" w:lastColumn="0" w:lastRow="0" w:noHBand="0" w:noVBand="1" w:val="04A0"/>
+        <w:tblBorders>
+          <w:top w:val="single" w:sz="4" w:space="0" w:color="7F7F7F"/>
+          <w:left w:val="single" w:sz="4" w:space="0" w:color="7F7F7F"/>
+          <w:bottom w:val="single" w:sz="4" w:space="0" w:color="7F7F7F"/>
+          <w:right w:val="single" w:sz="4" w:space="0" w:color="7F7F7F"/>
+          <w:insideH w:val="single" w:sz="4" w:space="0" w:color="7F7F7F"/>
+          <w:insideV w:val="single" w:sz="4" w:space="0" w:color="7F7F7F"/>
+        </w:tblBorders>
+        <w:tblLayout w:type="fixed"/>
+        <w:tblW w:w="9298" w:type="dxa"/>
+      </w:tblPr>
+      <w:tblGrid>
+        <w:gridCol w:w="1757"/>
+        <w:gridCol w:w="2721"/>
+        <w:gridCol w:w="4819"/>
+      </w:tblGrid>
+      <w:tr>
+        <w:trPr>
+          <w:tblHeader w:val="true"/>
+        </w:trPr>
+        <w:tc>
+          <w:tcPr>
+            <w:tcW w:type="dxa" w:w="1757"/>
+            <w:shd w:val="clear" w:color="auto" w:fill="1F3864"/>
+            <w:tcMar>
+              <w:top w:w="40" w:type="dxa"/>
+              <w:left w:w="80" w:type="dxa"/>
+              <w:bottom w:w="40" w:type="dxa"/>
+              <w:right w:w="80" w:type="dxa"/>
+            </w:tcMar>
+          </w:tcPr>
+          <w:p>
+            <w:pPr>
+              <w:spacing w:before="20" w:after="20"/>
+            </w:pPr>
+            <w:r/>
+            <w:r>
+              <w:rPr>
+                <w:b/>
+                <w:i w:val="0"/>
+                <w:color w:val="FFFFFF"/>
+                <w:sz w:val="18"/>
+              </w:rPr>
+              <w:t>Capa</w:t>
+            </w:r>
+          </w:p>
+        </w:tc>
+        <w:tc>
+          <w:tcPr>
+            <w:tcW w:type="dxa" w:w="2721"/>
+            <w:shd w:val="clear" w:color="auto" w:fill="1F3864"/>
+            <w:tcMar>
+              <w:top w:w="40" w:type="dxa"/>
+              <w:left w:w="80" w:type="dxa"/>
+              <w:bottom w:w="40" w:type="dxa"/>
+              <w:right w:w="80" w:type="dxa"/>
+            </w:tcMar>
+          </w:tcPr>
+          <w:p>
+            <w:pPr>
+              <w:spacing w:before="20" w:after="20"/>
+            </w:pPr>
+            <w:r/>
+            <w:r>
+              <w:rPr>
+                <w:b/>
+                <w:i w:val="0"/>
+                <w:color w:val="FFFFFF"/>
+                <w:sz w:val="18"/>
+              </w:rPr>
+              <w:t>Paso</w:t>
+            </w:r>
+          </w:p>
+        </w:tc>
+        <w:tc>
+          <w:tcPr>
+            <w:tcW w:type="dxa" w:w="4819"/>
+            <w:shd w:val="clear" w:color="auto" w:fill="1F3864"/>
+            <w:tcMar>
+              <w:top w:w="40" w:type="dxa"/>
+              <w:left w:w="80" w:type="dxa"/>
+              <w:bottom w:w="40" w:type="dxa"/>
+              <w:right w:w="80" w:type="dxa"/>
+            </w:tcMar>
+          </w:tcPr>
+          <w:p>
+            <w:pPr>
+              <w:spacing w:before="20" w:after="20"/>
+            </w:pPr>
+            <w:r/>
+            <w:r>
+              <w:rPr>
+                <w:b/>
+                <w:i w:val="0"/>
+                <w:color w:val="FFFFFF"/>
+                <w:sz w:val="18"/>
+              </w:rPr>
+              <w:t>Qué ocurre</w:t>
+            </w:r>
+          </w:p>
+        </w:tc>
+      </w:tr>
+      <w:tr>
+        <w:tc>
+          <w:tcPr>
+            <w:tcW w:type="dxa" w:w="1757"/>
+            <w:shd w:val="clear" w:color="auto" w:fill="1D4ED8"/>
+            <w:tcMar>
+              <w:top w:w="40" w:type="dxa"/>
+              <w:left w:w="80" w:type="dxa"/>
+              <w:bottom w:w="40" w:type="dxa"/>
+              <w:right w:w="80" w:type="dxa"/>
+            </w:tcMar>
+            <w:vAlign w:val="center"/>
+          </w:tcPr>
+          <w:p>
+            <w:pPr>
+              <w:spacing w:before="20" w:after="20"/>
+              <w:jc w:val="center"/>
+            </w:pPr>
+            <w:r/>
+            <w:r>
+              <w:rPr>
+                <w:b/>
+                <w:i w:val="0"/>
+                <w:color w:val="FFFFFF"/>
+                <w:sz w:val="13"/>
+              </w:rPr>
+              <w:t>PRESENTACIÓN</w:t>
+            </w:r>
+          </w:p>
+        </w:tc>
+        <w:tc>
+          <w:tcPr>
+            <w:tcW w:type="dxa" w:w="2721"/>
+            <w:tcMar>
+              <w:top w:w="40" w:type="dxa"/>
+              <w:left w:w="80" w:type="dxa"/>
+              <w:bottom w:w="40" w:type="dxa"/>
+              <w:right w:w="80" w:type="dxa"/>
+            </w:tcMar>
+          </w:tcPr>
+          <w:p>
+            <w:pPr>
+              <w:spacing w:before="20" w:after="20"/>
+            </w:pPr>
+            <w:r/>
+            <w:r>
+              <w:rPr>
+                <w:b/>
+                <w:i w:val="0"/>
+                <w:color w:val="1F2937"/>
+                <w:sz w:val="17"/>
+              </w:rPr>
+              <w:t>El usuario envía el formulario</w:t>
+            </w:r>
+          </w:p>
+        </w:tc>
+        <w:tc>
+          <w:tcPr>
+            <w:tcW w:type="dxa" w:w="4819"/>
+            <w:tcMar>
+              <w:top w:w="40" w:type="dxa"/>
+              <w:left w:w="80" w:type="dxa"/>
+              <w:bottom w:w="40" w:type="dxa"/>
+              <w:right w:w="80" w:type="dxa"/>
+            </w:tcMar>
+          </w:tcPr>
+          <w:p>
+            <w:pPr>
+              <w:spacing w:before="20" w:after="20"/>
+            </w:pPr>
+            <w:r/>
+            <w:r>
+              <w:rPr>
+                <w:b w:val="0"/>
+                <w:i w:val="0"/>
+                <w:sz w:val="17"/>
+              </w:rPr>
+              <w:t>La vista entrega los 11 campos crudos al controlador, sin interpretarlos</w:t>
+            </w:r>
+          </w:p>
+        </w:tc>
+      </w:tr>
+      <w:tr>
+        <w:tc>
+          <w:tcPr>
+            <w:tcW w:type="dxa" w:w="1757"/>
+            <w:shd w:val="clear" w:color="auto" w:fill="8B5CF6"/>
+            <w:tcMar>
+              <w:top w:w="40" w:type="dxa"/>
+              <w:left w:w="80" w:type="dxa"/>
+              <w:bottom w:w="40" w:type="dxa"/>
+              <w:right w:w="80" w:type="dxa"/>
+            </w:tcMar>
+            <w:vAlign w:val="center"/>
+          </w:tcPr>
+          <w:p>
+            <w:pPr>
+              <w:spacing w:before="20" w:after="20"/>
+              <w:jc w:val="center"/>
+            </w:pPr>
+            <w:r/>
+            <w:r>
+              <w:rPr>
+                <w:b/>
+                <w:i w:val="0"/>
+                <w:color w:val="FFFFFF"/>
+                <w:sz w:val="13"/>
+              </w:rPr>
+              <w:t>APLICACIÓN</w:t>
+            </w:r>
+          </w:p>
+        </w:tc>
+        <w:tc>
+          <w:tcPr>
+            <w:tcW w:type="dxa" w:w="2721"/>
+            <w:tcMar>
+              <w:top w:w="40" w:type="dxa"/>
+              <w:left w:w="80" w:type="dxa"/>
+              <w:bottom w:w="40" w:type="dxa"/>
+              <w:right w:w="80" w:type="dxa"/>
+            </w:tcMar>
+          </w:tcPr>
+          <w:p>
+            <w:pPr>
+              <w:spacing w:before="20" w:after="20"/>
+            </w:pPr>
+            <w:r/>
+            <w:r>
+              <w:rPr>
+                <w:b/>
+                <w:i w:val="0"/>
+                <w:color w:val="1F2937"/>
+                <w:sz w:val="17"/>
+              </w:rPr>
+              <w:t>SubmitCreditApplicationUseCase.execute()</w:t>
+            </w:r>
+          </w:p>
+        </w:tc>
+        <w:tc>
+          <w:tcPr>
+            <w:tcW w:type="dxa" w:w="4819"/>
+            <w:tcMar>
+              <w:top w:w="40" w:type="dxa"/>
+              <w:left w:w="80" w:type="dxa"/>
+              <w:bottom w:w="40" w:type="dxa"/>
+              <w:right w:w="80" w:type="dxa"/>
+            </w:tcMar>
+          </w:tcPr>
+          <w:p>
+            <w:pPr>
+              <w:spacing w:before="20" w:after="20"/>
+            </w:pPr>
+            <w:r/>
+            <w:r>
+              <w:rPr>
+                <w:b w:val="0"/>
+                <w:i w:val="0"/>
+                <w:sz w:val="17"/>
+              </w:rPr>
+              <w:t>Orquesta la secuencia completa y captura cualquier error para devolverlo como Result</w:t>
+            </w:r>
+          </w:p>
+        </w:tc>
+      </w:tr>
+      <w:tr>
+        <w:tc>
+          <w:tcPr>
+            <w:tcW w:type="dxa" w:w="1757"/>
+            <w:shd w:val="clear" w:color="auto" w:fill="1F3864"/>
+            <w:tcMar>
+              <w:top w:w="40" w:type="dxa"/>
+              <w:left w:w="80" w:type="dxa"/>
+              <w:bottom w:w="40" w:type="dxa"/>
+              <w:right w:w="80" w:type="dxa"/>
+            </w:tcMar>
+            <w:vAlign w:val="center"/>
+          </w:tcPr>
+          <w:p>
+            <w:pPr>
+              <w:spacing w:before="20" w:after="20"/>
+              <w:jc w:val="center"/>
+            </w:pPr>
+            <w:r/>
+            <w:r>
+              <w:rPr>
+                <w:b/>
+                <w:i w:val="0"/>
+                <w:color w:val="FFFFFF"/>
+                <w:sz w:val="13"/>
+              </w:rPr>
+              <w:t>DOMINIO</w:t>
+            </w:r>
+          </w:p>
+        </w:tc>
+        <w:tc>
+          <w:tcPr>
+            <w:tcW w:type="dxa" w:w="2721"/>
+            <w:tcMar>
+              <w:top w:w="40" w:type="dxa"/>
+              <w:left w:w="80" w:type="dxa"/>
+              <w:bottom w:w="40" w:type="dxa"/>
+              <w:right w:w="80" w:type="dxa"/>
+            </w:tcMar>
+          </w:tcPr>
+          <w:p>
+            <w:pPr>
+              <w:spacing w:before="20" w:after="20"/>
+            </w:pPr>
+            <w:r/>
+            <w:r>
+              <w:rPr>
+                <w:b/>
+                <w:i w:val="0"/>
+                <w:color w:val="1F2937"/>
+                <w:sz w:val="17"/>
+              </w:rPr>
+              <w:t>Construcción de los value objects</w:t>
+            </w:r>
+          </w:p>
+        </w:tc>
+        <w:tc>
+          <w:tcPr>
+            <w:tcW w:type="dxa" w:w="4819"/>
+            <w:tcMar>
+              <w:top w:w="40" w:type="dxa"/>
+              <w:left w:w="80" w:type="dxa"/>
+              <w:bottom w:w="40" w:type="dxa"/>
+              <w:right w:w="80" w:type="dxa"/>
+            </w:tcMar>
+          </w:tcPr>
+          <w:p>
+            <w:pPr>
+              <w:spacing w:before="20" w:after="20"/>
+            </w:pPr>
+            <w:r/>
+            <w:r>
+              <w:rPr>
+                <w:b w:val="0"/>
+                <w:i w:val="0"/>
+                <w:sz w:val="17"/>
+              </w:rPr>
+              <w:t>Applicant, RequestedCredit y EmploymentInfo validan nombre, cédula, correo, teléfono, monto, plazo, destino, empresa, cargo e ingresos</w:t>
+            </w:r>
+          </w:p>
+        </w:tc>
+      </w:tr>
+      <w:tr>
+        <w:tc>
+          <w:tcPr>
+            <w:tcW w:type="dxa" w:w="1757"/>
+            <w:shd w:val="clear" w:color="auto" w:fill="1F3864"/>
+            <w:tcMar>
+              <w:top w:w="40" w:type="dxa"/>
+              <w:left w:w="80" w:type="dxa"/>
+              <w:bottom w:w="40" w:type="dxa"/>
+              <w:right w:w="80" w:type="dxa"/>
+            </w:tcMar>
+            <w:vAlign w:val="center"/>
+          </w:tcPr>
+          <w:p>
+            <w:pPr>
+              <w:spacing w:before="20" w:after="20"/>
+              <w:jc w:val="center"/>
+            </w:pPr>
+            <w:r/>
+            <w:r>
+              <w:rPr>
+                <w:b/>
+                <w:i w:val="0"/>
+                <w:color w:val="FFFFFF"/>
+                <w:sz w:val="13"/>
+              </w:rPr>
+              <w:t>DOMINIO</w:t>
+            </w:r>
+          </w:p>
+        </w:tc>
+        <w:tc>
+          <w:tcPr>
+            <w:tcW w:type="dxa" w:w="2721"/>
+            <w:tcMar>
+              <w:top w:w="40" w:type="dxa"/>
+              <w:left w:w="80" w:type="dxa"/>
+              <w:bottom w:w="40" w:type="dxa"/>
+              <w:right w:w="80" w:type="dxa"/>
+            </w:tcMar>
+          </w:tcPr>
+          <w:p>
+            <w:pPr>
+              <w:spacing w:before="20" w:after="20"/>
+            </w:pPr>
+            <w:r/>
+            <w:r>
+              <w:rPr>
+                <w:b/>
+                <w:i w:val="0"/>
+                <w:color w:val="1F2937"/>
+                <w:sz w:val="17"/>
+              </w:rPr>
+              <w:t>CreditApplicationPolicy.assertAdmissible()</w:t>
+            </w:r>
+          </w:p>
+        </w:tc>
+        <w:tc>
+          <w:tcPr>
+            <w:tcW w:type="dxa" w:w="4819"/>
+            <w:tcMar>
+              <w:top w:w="40" w:type="dxa"/>
+              <w:left w:w="80" w:type="dxa"/>
+              <w:bottom w:w="40" w:type="dxa"/>
+              <w:right w:w="80" w:type="dxa"/>
+            </w:tcMar>
+          </w:tcPr>
+          <w:p>
+            <w:pPr>
+              <w:spacing w:before="20" w:after="20"/>
+            </w:pPr>
+            <w:r/>
+            <w:r>
+              <w:rPr>
+                <w:b w:val="0"/>
+                <w:i w:val="0"/>
+                <w:sz w:val="17"/>
+              </w:rPr>
+              <w:t>Comprueba que el monto y el plazo estén dentro de lo que admite el producto elegido; si no, lanza ValidationError con el mensaje por campo</w:t>
+            </w:r>
+          </w:p>
+        </w:tc>
+      </w:tr>
+      <w:tr>
+        <w:tc>
+          <w:tcPr>
+            <w:tcW w:type="dxa" w:w="1757"/>
+            <w:shd w:val="clear" w:color="auto" w:fill="1F3864"/>
+            <w:tcMar>
+              <w:top w:w="40" w:type="dxa"/>
+              <w:left w:w="80" w:type="dxa"/>
+              <w:bottom w:w="40" w:type="dxa"/>
+              <w:right w:w="80" w:type="dxa"/>
+            </w:tcMar>
+            <w:vAlign w:val="center"/>
+          </w:tcPr>
+          <w:p>
+            <w:pPr>
+              <w:spacing w:before="20" w:after="20"/>
+              <w:jc w:val="center"/>
+            </w:pPr>
+            <w:r/>
+            <w:r>
+              <w:rPr>
+                <w:b/>
+                <w:i w:val="0"/>
+                <w:color w:val="FFFFFF"/>
+                <w:sz w:val="13"/>
+              </w:rPr>
+              <w:t>DOMINIO</w:t>
+            </w:r>
+          </w:p>
+        </w:tc>
+        <w:tc>
+          <w:tcPr>
+            <w:tcW w:type="dxa" w:w="2721"/>
+            <w:tcMar>
+              <w:top w:w="40" w:type="dxa"/>
+              <w:left w:w="80" w:type="dxa"/>
+              <w:bottom w:w="40" w:type="dxa"/>
+              <w:right w:w="80" w:type="dxa"/>
+            </w:tcMar>
+          </w:tcPr>
+          <w:p>
+            <w:pPr>
+              <w:spacing w:before="20" w:after="20"/>
+            </w:pPr>
+            <w:r/>
+            <w:r>
+              <w:rPr>
+                <w:b/>
+                <w:i w:val="0"/>
+                <w:color w:val="1F2937"/>
+                <w:sz w:val="17"/>
+              </w:rPr>
+              <w:t>assessAffordability()</w:t>
+            </w:r>
+          </w:p>
+        </w:tc>
+        <w:tc>
+          <w:tcPr>
+            <w:tcW w:type="dxa" w:w="4819"/>
+            <w:tcMar>
+              <w:top w:w="40" w:type="dxa"/>
+              <w:left w:w="80" w:type="dxa"/>
+              <w:bottom w:w="40" w:type="dxa"/>
+              <w:right w:w="80" w:type="dxa"/>
+            </w:tcMar>
+          </w:tcPr>
+          <w:p>
+            <w:pPr>
+              <w:spacing w:before="20" w:after="20"/>
+            </w:pPr>
+            <w:r/>
+            <w:r>
+              <w:rPr>
+                <w:b w:val="0"/>
+                <w:i w:val="0"/>
+                <w:sz w:val="17"/>
+              </w:rPr>
+              <w:t>Estima la cuota con el sistema francés y verifica que no supere el 40 % del ingreso declarado</w:t>
+            </w:r>
+          </w:p>
+        </w:tc>
+      </w:tr>
+      <w:tr>
+        <w:tc>
+          <w:tcPr>
+            <w:tcW w:type="dxa" w:w="1757"/>
+            <w:shd w:val="clear" w:color="auto" w:fill="1F3864"/>
+            <w:tcMar>
+              <w:top w:w="40" w:type="dxa"/>
+              <w:left w:w="80" w:type="dxa"/>
+              <w:bottom w:w="40" w:type="dxa"/>
+              <w:right w:w="80" w:type="dxa"/>
+            </w:tcMar>
+            <w:vAlign w:val="center"/>
+          </w:tcPr>
+          <w:p>
+            <w:pPr>
+              <w:spacing w:before="20" w:after="20"/>
+              <w:jc w:val="center"/>
+            </w:pPr>
+            <w:r/>
+            <w:r>
+              <w:rPr>
+                <w:b/>
+                <w:i w:val="0"/>
+                <w:color w:val="FFFFFF"/>
+                <w:sz w:val="13"/>
+              </w:rPr>
+              <w:t>DOMINIO</w:t>
+            </w:r>
+          </w:p>
+        </w:tc>
+        <w:tc>
+          <w:tcPr>
+            <w:tcW w:type="dxa" w:w="2721"/>
+            <w:tcMar>
+              <w:top w:w="40" w:type="dxa"/>
+              <w:left w:w="80" w:type="dxa"/>
+              <w:bottom w:w="40" w:type="dxa"/>
+              <w:right w:w="80" w:type="dxa"/>
+            </w:tcMar>
+          </w:tcPr>
+          <w:p>
+            <w:pPr>
+              <w:spacing w:before="20" w:after="20"/>
+            </w:pPr>
+            <w:r/>
+            <w:r>
+              <w:rPr>
+                <w:b/>
+                <w:i w:val="0"/>
+                <w:color w:val="1F2937"/>
+                <w:sz w:val="17"/>
+              </w:rPr>
+              <w:t>application.submit()</w:t>
+            </w:r>
+          </w:p>
+        </w:tc>
+        <w:tc>
+          <w:tcPr>
+            <w:tcW w:type="dxa" w:w="4819"/>
+            <w:tcMar>
+              <w:top w:w="40" w:type="dxa"/>
+              <w:left w:w="80" w:type="dxa"/>
+              <w:bottom w:w="40" w:type="dxa"/>
+              <w:right w:w="80" w:type="dxa"/>
+            </w:tcMar>
+          </w:tcPr>
+          <w:p>
+            <w:pPr>
+              <w:spacing w:before="20" w:after="20"/>
+            </w:pPr>
+            <w:r/>
+            <w:r>
+              <w:rPr>
+                <w:b w:val="0"/>
+                <w:i w:val="0"/>
+                <w:sz w:val="17"/>
+              </w:rPr>
+              <w:t>Transición DRAFT → SUBMITTED y generación de la referencia CS-XXXXXXXX</w:t>
+            </w:r>
+          </w:p>
+        </w:tc>
+      </w:tr>
+      <w:tr>
+        <w:tc>
+          <w:tcPr>
+            <w:tcW w:type="dxa" w:w="1757"/>
+            <w:shd w:val="clear" w:color="auto" w:fill="F59E0B"/>
+            <w:tcMar>
+              <w:top w:w="40" w:type="dxa"/>
+              <w:left w:w="80" w:type="dxa"/>
+              <w:bottom w:w="40" w:type="dxa"/>
+              <w:right w:w="80" w:type="dxa"/>
+            </w:tcMar>
+            <w:vAlign w:val="center"/>
+          </w:tcPr>
+          <w:p>
+            <w:pPr>
+              <w:spacing w:before="20" w:after="20"/>
+              <w:jc w:val="center"/>
+            </w:pPr>
+            <w:r/>
+            <w:r>
+              <w:rPr>
+                <w:b/>
+                <w:i w:val="0"/>
+                <w:color w:val="FFFFFF"/>
+                <w:sz w:val="13"/>
+              </w:rPr>
+              <w:t>INFRAESTRUCTURA</w:t>
+            </w:r>
+          </w:p>
+        </w:tc>
+        <w:tc>
+          <w:tcPr>
+            <w:tcW w:type="dxa" w:w="2721"/>
+            <w:tcMar>
+              <w:top w:w="40" w:type="dxa"/>
+              <w:left w:w="80" w:type="dxa"/>
+              <w:bottom w:w="40" w:type="dxa"/>
+              <w:right w:w="80" w:type="dxa"/>
+            </w:tcMar>
+          </w:tcPr>
+          <w:p>
+            <w:pPr>
+              <w:spacing w:before="20" w:after="20"/>
+            </w:pPr>
+            <w:r/>
+            <w:r>
+              <w:rPr>
+                <w:b/>
+                <w:i w:val="0"/>
+                <w:color w:val="1F2937"/>
+                <w:sz w:val="17"/>
+              </w:rPr>
+              <w:t>LocalStorageCreditApplicationRepository.save()</w:t>
+            </w:r>
+          </w:p>
+        </w:tc>
+        <w:tc>
+          <w:tcPr>
+            <w:tcW w:type="dxa" w:w="4819"/>
+            <w:tcMar>
+              <w:top w:w="40" w:type="dxa"/>
+              <w:left w:w="80" w:type="dxa"/>
+              <w:bottom w:w="40" w:type="dxa"/>
+              <w:right w:w="80" w:type="dxa"/>
+            </w:tcMar>
+          </w:tcPr>
+          <w:p>
+            <w:pPr>
+              <w:spacing w:before="20" w:after="20"/>
+            </w:pPr>
+            <w:r/>
+            <w:r>
+              <w:rPr>
+                <w:b w:val="0"/>
+                <w:i w:val="0"/>
+                <w:sz w:val="17"/>
+              </w:rPr>
+              <w:t>Persiste la solicitud; si localStorage no está disponible, guarda en memoria</w:t>
+            </w:r>
+          </w:p>
+        </w:tc>
+      </w:tr>
+      <w:tr>
+        <w:tc>
+          <w:tcPr>
+            <w:tcW w:type="dxa" w:w="1757"/>
+            <w:shd w:val="clear" w:color="auto" w:fill="1D4ED8"/>
+            <w:tcMar>
+              <w:top w:w="40" w:type="dxa"/>
+              <w:left w:w="80" w:type="dxa"/>
+              <w:bottom w:w="40" w:type="dxa"/>
+              <w:right w:w="80" w:type="dxa"/>
+            </w:tcMar>
+            <w:vAlign w:val="center"/>
+          </w:tcPr>
+          <w:p>
+            <w:pPr>
+              <w:spacing w:before="20" w:after="20"/>
+              <w:jc w:val="center"/>
+            </w:pPr>
+            <w:r/>
+            <w:r>
+              <w:rPr>
+                <w:b/>
+                <w:i w:val="0"/>
+                <w:color w:val="FFFFFF"/>
+                <w:sz w:val="13"/>
+              </w:rPr>
+              <w:t>PRESENTACIÓN</w:t>
+            </w:r>
+          </w:p>
+        </w:tc>
+        <w:tc>
+          <w:tcPr>
+            <w:tcW w:type="dxa" w:w="2721"/>
+            <w:tcMar>
+              <w:top w:w="40" w:type="dxa"/>
+              <w:left w:w="80" w:type="dxa"/>
+              <w:bottom w:w="40" w:type="dxa"/>
+              <w:right w:w="80" w:type="dxa"/>
+            </w:tcMar>
+          </w:tcPr>
+          <w:p>
+            <w:pPr>
+              <w:spacing w:before="20" w:after="20"/>
+            </w:pPr>
+            <w:r/>
+            <w:r>
+              <w:rPr>
+                <w:b/>
+                <w:i w:val="0"/>
+                <w:color w:val="1F2937"/>
+                <w:sz w:val="17"/>
+              </w:rPr>
+              <w:t>Confirmación en pantalla</w:t>
+            </w:r>
+          </w:p>
+        </w:tc>
+        <w:tc>
+          <w:tcPr>
+            <w:tcW w:type="dxa" w:w="4819"/>
+            <w:tcMar>
+              <w:top w:w="40" w:type="dxa"/>
+              <w:left w:w="80" w:type="dxa"/>
+              <w:bottom w:w="40" w:type="dxa"/>
+              <w:right w:w="80" w:type="dxa"/>
+            </w:tcMar>
+          </w:tcPr>
+          <w:p>
+            <w:pPr>
+              <w:spacing w:before="20" w:after="20"/>
+            </w:pPr>
+            <w:r/>
+            <w:r>
+              <w:rPr>
+                <w:b w:val="0"/>
+                <w:i w:val="0"/>
+                <w:sz w:val="17"/>
+              </w:rPr>
+              <w:t>Se muestra el número de radicación y un aviso accesible; si hubo errores, cada mensaje aparece bajo su campo</w:t>
+            </w:r>
+          </w:p>
+        </w:tc>
+      </w:tr>
+    </w:tbl>
+    <w:p/>
+    <w:p>
+      <w:pPr>
+        <w:spacing w:after="200"/>
+        <w:jc w:val="center"/>
+      </w:pPr>
+      <w:r>
+        <w:rPr>
+          <w:i/>
+          <w:color w:val="6B7280"/>
+          <w:sz w:val="17"/>
+        </w:rPr>
+        <w:t>Figura 15. Flujo 5: validación, política de dominio, radicación y persistencia</w:t>
       </w:r>
     </w:p>
     <w:p>
@@ -21740,7 +23491,7 @@
           <w:color w:val="6B7280"/>
           <w:sz w:val="17"/>
         </w:rPr>
-        <w:t>Tabla 20. Los seis productos del catálogo, con el emoji y la paleta que identifican a cada uno. Los cinco primeros replican el sitio original; «Crédito de Libranza» se añadió en este proyecto con la paleta teal</w:t>
+        <w:t>Tabla 21. Los seis productos del catálogo, con el emoji y la paleta que identifican a cada uno. Los cinco primeros replican el sitio original; «Crédito de Libranza» se añadió en este proyecto con la paleta teal</w:t>
       </w:r>
     </w:p>
     <w:p>
@@ -21794,7 +23545,7 @@
           <w:color w:val="6B7280"/>
           <w:sz w:val="17"/>
         </w:rPr>
-        <w:t>Figura 15. Comparación de tasas: el crédito educativo es el más barato (10,5 %), la libranza le sigue (13,5 %) y el de libre inversión es el más costoso (18,5 %)</w:t>
+        <w:t>Figura 16. Comparación de tasas: el crédito educativo es el más barato (10,5 %), la libranza le sigue (13,5 %) y el de libre inversión es el más costoso (18,5 %)</w:t>
       </w:r>
     </w:p>
     <w:p>
@@ -21848,7 +23599,7 @@
           <w:color w:val="6B7280"/>
           <w:sz w:val="17"/>
         </w:rPr>
-        <w:t>Figura 16. Rangos de monto en escala logarítmica: el filtro del simulador selecciona por solapamiento de rangos, no por pertenencia</w:t>
+        <w:t>Figura 17. Rangos de monto en escala logarítmica: el filtro del simulador selecciona por solapamiento de rangos, no por pertenencia</w:t>
       </w:r>
     </w:p>
     <w:p>
@@ -21902,7 +23653,7 @@
           <w:color w:val="6B7280"/>
           <w:sz w:val="17"/>
         </w:rPr>
-        <w:t>Figura 17. Plazo máximo por producto: desde 5 años en libre inversión hasta 20 años en vivienda</w:t>
+        <w:t>Figura 18. Plazo máximo por producto: desde 5 años en libre inversión hasta 20 años en vivienda</w:t>
       </w:r>
     </w:p>
     <w:p>
@@ -22425,7 +24176,7 @@
           <w:color w:val="6B7280"/>
           <w:sz w:val="17"/>
         </w:rPr>
-        <w:t>Tabla 21. Las cinco opciones del filtro por monto y su resultado</w:t>
+        <w:t>Tabla 22. Las cinco opciones del filtro por monto y su resultado</w:t>
       </w:r>
     </w:p>
     <w:p>
@@ -23198,7 +24949,7 @@
           <w:color w:val="6B7280"/>
           <w:sz w:val="17"/>
         </w:rPr>
-        <w:t>Tabla 22. Etiquetas semánticas y su uso real en el proyecto</w:t>
+        <w:t>Tabla 23. Etiquetas semánticas y su uso real en el proyecto</w:t>
       </w:r>
     </w:p>
     <w:p>
@@ -23570,7 +25321,7 @@
           <w:color w:val="6B7280"/>
           <w:sz w:val="17"/>
         </w:rPr>
-        <w:t>Tabla 23. Los once campos del formulario y sus reglas de validación</w:t>
+        <w:t>Tabla 24. Los once campos del formulario y sus reglas de validación</w:t>
       </w:r>
     </w:p>
     <w:p>
@@ -23632,7 +25383,7 @@
           <w:color w:val="6B7280"/>
           <w:sz w:val="17"/>
         </w:rPr>
-        <w:t>Figura 18. Las 1.452 líneas de CSS repartidas en siete archivos que se cargan por especificidad creciente</w:t>
+        <w:t>Figura 19. Las 1.681 líneas de CSS repartidas en siete archivos que se cargan por especificidad creciente</w:t>
       </w:r>
     </w:p>
     <w:p>
@@ -24166,7 +25917,7 @@
           <w:color w:val="6B7280"/>
           <w:sz w:val="17"/>
         </w:rPr>
-        <w:t>Tabla 24. Recursos de CSS3 aplicados</w:t>
+        <w:t>Tabla 25. Recursos de CSS3 aplicados</w:t>
       </w:r>
     </w:p>
     <w:p>
@@ -24228,7 +25979,7 @@
           <w:color w:val="6B7280"/>
           <w:sz w:val="17"/>
         </w:rPr>
-        <w:t>Figura 19. Mobile-first: una columna en móvil, dos en tablet y tres en escritorio, con el mismo marcado</w:t>
+        <w:t>Figura 20. Mobile-first: una columna en móvil, dos en tablet y tres en escritorio, con el mismo marcado</w:t>
       </w:r>
     </w:p>
     <w:tbl>
@@ -24588,7 +26339,7 @@
           <w:color w:val="6B7280"/>
           <w:sz w:val="17"/>
         </w:rPr>
-        <w:t>Tabla 25. Los cuatro breakpoints y la hoja de impresión</w:t>
+        <w:t>Tabla 26. Los cuatro breakpoints y la hoja de impresión</w:t>
       </w:r>
     </w:p>
     <w:p>
@@ -25158,7 +26909,7 @@
           <w:color w:val="6B7280"/>
           <w:sz w:val="17"/>
         </w:rPr>
-        <w:t>Tabla 26. Medidas de accesibilidad</w:t>
+        <w:t>Tabla 27. Medidas de accesibilidad</w:t>
       </w:r>
     </w:p>
     <w:p>
@@ -25356,7 +27107,7 @@
           <w:color w:val="6B7280"/>
           <w:sz w:val="17"/>
         </w:rPr>
-        <w:t>Figura 20. Verificación mecánica de la regla de dependencia</w:t>
+        <w:t>Figura 21. Verificación mecánica de la regla de dependencia</w:t>
       </w:r>
     </w:p>
     <w:p>
@@ -25550,7 +27301,7 @@
                 <w:i w:val="0"/>
                 <w:sz w:val="18"/>
               </w:rPr>
-              <w:t>Invariantes de value objects y entidades, política de dominio, criterios de búsqueda, casos de uso y Result</w:t>
+              <w:t>85 comprobaciones: invariantes de value objects y entidades, servicios de dominio, amortización, criterios de búsqueda, los seis casos de uso y Result</w:t>
             </w:r>
           </w:p>
         </w:tc>
@@ -25655,7 +27406,7 @@
                 <w:i w:val="0"/>
                 <w:sz w:val="18"/>
               </w:rPr>
-              <w:t>Que las vistas generen el HTML esperado, el escapado de datos y la detección de dependencias circulares del contenedor</w:t>
+              <w:t>89 comprobaciones: que las vistas generen el HTML esperado, el simulador con su tabla y sus errores, el escapado de datos y la detección de dependencias circulares del contenedor</w:t>
             </w:r>
           </w:p>
         </w:tc>
@@ -25760,7 +27511,7 @@
                 <w:i w:val="0"/>
                 <w:sz w:val="18"/>
               </w:rPr>
-              <w:t>Arranque completo con jsdom: resolución de las 32 dependencias, navegación entre rutas, filtros del simulador, foco tras el re-render y pantalla 404</w:t>
+              <w:t>66 comprobaciones: arranque completo con jsdom, resolución de las 34 dependencias, navegación entre rutas, simulador y filtros en vivo, foco tras el re-render y pantalla 404</w:t>
             </w:r>
           </w:p>
         </w:tc>
@@ -25829,7 +27580,7 @@
           <w:color w:val="6B7280"/>
           <w:sz w:val="17"/>
         </w:rPr>
-        <w:t>Tabla 27. Las tres suites y su resultado en la última ejecución</w:t>
+        <w:t>Tabla 28. Las tres suites y su resultado en la última ejecución: 240 aserciones en verde</w:t>
       </w:r>
     </w:p>
     <w:p>
@@ -25843,7 +27594,7 @@
           <w:i w:val="0"/>
           <w:sz w:val="22"/>
         </w:rPr>
-        <w:t>Ejemplos de comprobaciones que imprime la ejecución: «monto fuera de rango rechazado por CreditApplicationPolicy» con el mensaje «El monto debe estar entre $5.000.000 y $120.000.000 para Crédito Vehículo»; «búsqueda "vivienda" → 1 tarjeta»; «rango "Hasta 5M" → 3 tarjetas»; «foco conservado tras re-render»; «contenedor resuelto (32 dependencias)». La tercera suite requiere jsdom: npm install jsdom --no-save.</w:t>
+        <w:t>Ejemplos de comprobaciones que imprime la ejecución: «monto fuera de rango rechazado por CreditApplicationPolicy» con el mensaje «El monto debe estar entre $5.000.000 y $120.000.000 para Crédito Vehículo»; «cuota fija esperada $357.000»; «la suma de los abonos a capital es exactamente el capital prestado»; «a 240 meses el saldo cierra en cero»; «recalcula al teclear el monto ($ 912.498)»; «búsqueda "vivienda" → 1 tarjeta»; «foco conservado tras re-render»; «contenedor resuelto (34 dependencias)». La tercera suite requiere jsdom: npm install jsdom --no-save.</w:t>
       </w:r>
     </w:p>
     <w:p>
@@ -26016,7 +27767,7 @@
           <w:color w:val="6B7280"/>
           <w:sz w:val="17"/>
         </w:rPr>
-        <w:t>Figura 21. Puesta en marcha</w:t>
+        <w:t>Figura 22. Puesta en marcha</w:t>
       </w:r>
     </w:p>
     <w:p>
@@ -26348,7 +28099,7 @@
                 <w:i w:val="0"/>
                 <w:sz w:val="18"/>
               </w:rPr>
-              <w:t>Paleta en variables (02-tokens.css), Grid y Flexbox, hover, transiciones, sombras y degradados; 1.452 líneas organizadas en 7 archivos sin un solo !important</w:t>
+              <w:t>Paleta en variables (02-tokens.css), Grid y Flexbox, hover, transiciones, sombras y degradados; 1.681 líneas organizadas en 7 archivos sin un solo !important</w:t>
             </w:r>
           </w:p>
         </w:tc>
@@ -26921,7 +28672,7 @@
           <w:color w:val="6B7280"/>
           <w:sz w:val="17"/>
         </w:rPr>
-        <w:t>Tabla 28. Correspondencia entre la rúbrica y la evidencia disponible</w:t>
+        <w:t>Tabla 29. Correspondencia entre la rúbrica y la evidencia disponible</w:t>
       </w:r>
     </w:p>
     <w:p>
@@ -27523,7 +29274,7 @@
           <w:color w:val="6B7280"/>
           <w:sz w:val="17"/>
         </w:rPr>
-        <w:t>Tabla 29. Todo lo que hubo que tocar para añadir un producto al catálogo</w:t>
+        <w:t>Tabla 30. Todo lo que hubo que tocar para añadir un producto al catálogo</w:t>
       </w:r>
     </w:p>
     <w:p>
@@ -28118,7 +29869,7 @@
           <w:color w:val="6B7280"/>
           <w:sz w:val="17"/>
         </w:rPr>
-        <w:t>Tabla 30. Lista de verificación previa a la entrega</w:t>
+        <w:t>Tabla 31. Lista de verificación previa a la entrega</w:t>
       </w:r>
     </w:p>
     <w:p>
@@ -28734,7 +30485,7 @@
           <w:color w:val="6B7280"/>
           <w:sz w:val="17"/>
         </w:rPr>
-        <w:t>Tabla 31. Correspondencia con los archivos exigidos</w:t>
+        <w:t>Tabla 32. Correspondencia con los archivos exigidos</w:t>
       </w:r>
     </w:p>
     <w:p>
@@ -29363,7 +31114,7 @@
           <w:color w:val="6B7280"/>
           <w:sz w:val="17"/>
         </w:rPr>
-        <w:t>Tabla 32. Historial de commits del desarrollo</w:t>
+        <w:t>Tabla 33. Historial de commits del desarrollo</w:t>
       </w:r>
     </w:p>
     <w:p>
@@ -29694,7 +31445,7 @@
           <w:i w:val="0"/>
           <w:sz w:val="22"/>
         </w:rPr>
-        <w:t>El coste de la decisión también es honesto: hubo que escribir a mano el router, el mecanismo de render, el contenedor de dependencias y el sistema de contratos —en total 73 archivos y 5.308 líneas de JavaScript— donde un framework habría resuelto parte de eso. En el contexto de esta actividad ese coste es la evidencia del aprendizaje: cada pieza es propia y explicable.</w:t>
+        <w:t>El coste de la decisión también es honesto: hubo que escribir a mano el router, el mecanismo de render, el contenedor de dependencias y el sistema de contratos —en total 79 archivos y 6.881 líneas de JavaScript— donde un framework habría resuelto parte de eso. En el contexto de esta actividad ese coste es la evidencia del aprendizaje: cada pieza es propia y explicable.</w:t>
       </w:r>
     </w:p>
     <w:p>

</xml_diff>